<commit_message>
Herzie conceptmodel naar begrazingsregistratie
</commit_message>
<xml_diff>
--- a/Concept_databaseontwerp_begrazing_vanaf_2026_Zotero_gevalideerd.docx
+++ b/Concept_databaseontwerp_begrazing_vanaf_2026_Zotero_gevalideerd.docx
@@ -27,7 +27,7 @@
           <w:color w:val="183847"/>
           <w:sz w:val="50"/>
         </w:rPr>
-        <w:t>Begrazingsbeheer en latere effectevaluatie vanaf 2026</w:t>
+        <w:t>Begrazingsregistratie vanaf 2026</w:t>
       </w:r>
     </w:p>
     <w:p>
@@ -336,7 +336,7 @@
                 <w:color w:val="202124"/>
                 <w:sz w:val="19"/>
               </w:rPr>
-              <w:t>Beheerregistratie, ruimtelijke blootstelling en koppeling met ecologische meetreeksen</w:t>
+              <w:t>Uitsluitend begrazing; voorbereid op latere koppeling en uitbreiding</w:t>
             </w:r>
           </w:p>
         </w:tc>
@@ -440,7 +440,7 @@
           <w:color w:val="202124"/>
           <w:sz w:val="21"/>
         </w:rPr>
-        <w:t>Het oorspronkelijke concept was in hoofdlijnen juist: stabiele gebiedsidentiteiten, versieerbare geometrie, tijdvakken, exacte kuddesamenstelling, GVE-normalisatie, exclosures, andere beheermaatregelen en vergelijkingsgebieden zijn allemaal nodig. De Zotero-documenten maken echter vijf aanvullingen noodzakelijk.</w:t>
+        <w:t>De Zotero-documenten bevestigen de kern van het oorspronkelijke concept: stabiele gebiedsidentiteiten, versieerbare geometrie, tijdvakken, exacte kuddesamenstelling, GVE-normalisatie en expliciete registratie van onderbrekingen en uitvoeringsafwijkingen. Voor deze fase is het model bewust versmald tot begrazing.</w:t>
       </w:r>
     </w:p>
     <w:tbl>
@@ -653,7 +653,7 @@
                 <w:color w:val="202124"/>
                 <w:sz w:val="18"/>
               </w:rPr>
-              <w:t>Context</w:t>
+              <w:t>Tijdvakken</w:t>
             </w:r>
           </w:p>
         </w:tc>
@@ -678,7 +678,7 @@
                 <w:color w:val="202124"/>
                 <w:sz w:val="18"/>
               </w:rPr>
-              <w:t>Kalkrijkdom, bodem, vocht, habitat, weer en droogte, stikstofdepositie, konijnen en andere wilde grazers moeten als mogelijke verklarende of verstorende factoren koppelbaar zijn.</w:t>
+              <w:t>Een nieuw faserecord is nodig zodra toegankelijk gebied, kuddesamenstelling, aantal dieren, regime of onderbrekingsstatus verandert.</w:t>
             </w:r>
           </w:p>
         </w:tc>
@@ -709,7 +709,7 @@
                 <w:color w:val="202124"/>
                 <w:sz w:val="18"/>
               </w:rPr>
-              <w:t>Monitoring</w:t>
+              <w:t>Koppelbaarheid</w:t>
             </w:r>
           </w:p>
         </w:tc>
@@ -735,7 +735,7 @@
                 <w:color w:val="202124"/>
                 <w:sz w:val="18"/>
               </w:rPr>
-              <w:t>Niet alleen de meetlocatie maar ook haar geometrie en geldigheidsperiode moeten versieerbaar zijn. Protocolversie, inspanning, waarnemer en omstandigheden horen bij ieder meetbezoek.</w:t>
+              <w:t>Stabiele codes, geldigheidsperioden, brongeometrieën en externe sleutels maken latere verbinding met andere gegevens mogelijk zonder die gegevens nu in dit model op te nemen.</w:t>
             </w:r>
           </w:p>
         </w:tc>
@@ -765,7 +765,7 @@
                 <w:color w:val="202124"/>
                 <w:sz w:val="18"/>
               </w:rPr>
-              <w:t>Vergelijking</w:t>
+              <w:t>Afbakening</w:t>
             </w:r>
           </w:p>
         </w:tc>
@@ -790,7 +790,7 @@
                 <w:color w:val="202124"/>
                 <w:sz w:val="18"/>
               </w:rPr>
-              <w:t>Het model moet zowel onbegraasde controles als continu begraasde referenties ondersteunen en een voor-na-controle-impactopzet kunnen beschrijven.</w:t>
+              <w:t>Een neutrale basisentiteit laat toekomstige uitbreiding toe. In dit document wordt alleen het subtype begrazing functioneel uitgewerkt.</w:t>
             </w:r>
           </w:p>
         </w:tc>
@@ -862,7 +862,7 @@
         <w:keepNext/>
       </w:pPr>
       <w:r>
-        <w:t>2.3 Uitgangssituatie en omgevingscontext zijn noodzakelijk</w:t>
+        <w:t>2.3 Koppelbaarheid vereist geen ecologisch deelmodel</w:t>
       </w:r>
     </w:p>
     <w:p>
@@ -876,7 +876,7 @@
           <w:color w:val="202124"/>
           <w:sz w:val="21"/>
         </w:rPr>
-        <w:t>De OBN-studies en het proefschrift Rabbits Rule laten zien dat begrazingsvorm, graasduur, bodemtype, kalkrijkdom, konijnenstand, stikstofdepositie en klimaat onderling verweven zijn. Zonder deze context kan een latere analyse wel gelijktijdigheid, maar nauwelijks een verantwoord begrazingseffect onderscheiden.</w:t>
+        <w:t>De beheerregistratie hoeft toekomstige meetreeksen niet zelf op te slaan. Zij moet wel eenduidig kunnen leveren waar en wanneer begrazing feitelijk plaatsvond. Daarom blijven stabiele gebiedscodes, geldigheidsperioden, geometrieën en een externe koppelsleutel onderdeel van het concept.</w:t>
       </w:r>
     </w:p>
     <w:p>
@@ -885,7 +885,7 @@
         <w:keepNext/>
       </w:pPr>
       <w:r>
-        <w:t>2.4 Effecten verschillen per natuurwaarde</w:t>
+        <w:t>2.4 Uitbreidbaar, maar nu alleen begrazing</w:t>
       </w:r>
     </w:p>
     <w:p>
@@ -899,30 +899,7 @@
           <w:color w:val="202124"/>
           <w:sz w:val="21"/>
         </w:rPr>
-        <w:t>Vegetatiestructuur, bloemaanbod, bodemfauna, dagvlinders, broedvogels en konijnen kunnen verschillend of zelfs tegengesteld reageren. Het model schrijft daarom geen enkelvoudige succesmaat voor. Het koppelt beheer aan meerdere bestaande ecologische meetreeksen met hun eigen protocollen.</w:t>
-      </w:r>
-    </w:p>
-    <w:p>
-      <w:pPr>
-        <w:pStyle w:val="Heading2"/>
-        <w:keepNext/>
-      </w:pPr>
-      <w:r>
-        <w:t>2.5 Voor-na plus vergelijking blijft de sterkste basis</w:t>
-      </w:r>
-    </w:p>
-    <w:p>
-      <w:pPr>
-        <w:spacing w:after="120" w:line="264" w:lineRule="auto"/>
-      </w:pPr>
-      <w:r>
-        <w:rPr>
-          <w:rFonts w:ascii="Arial" w:hAnsi="Arial"/>
-          <w:i w:val="0"/>
-          <w:color w:val="202124"/>
-          <w:sz w:val="21"/>
-        </w:rPr>
-        <w:t>Het OBN-onderzoek naar extensieve duinbegrazing gebruikt een BACI-opzet: begraasd en onbegraasd worden zowel vóór als na de maatregel gevolgd. Dit helpt autonome successie, jaarverschillen en weersinvloeden te onderscheiden. Een database kan deze onderzoeksopzet ondersteunen, maar niet vervangen.</w:t>
+        <w:t>Een neutrale beheergebeurtenis vormt de technische kapstok. Alleen de begrazingsperiode en de bijbehorende fasen, kuddes en afwijkingen worden nu beschreven. Eventuele latere uitbreidingen kunnen dezelfde ruimtelijke en temporele basis gebruiken zonder het begrazingsmodel te wijzigen.</w:t>
       </w:r>
     </w:p>
     <w:p>
@@ -1032,7 +1009,7 @@
                 <w:color w:val="202124"/>
                 <w:sz w:val="18"/>
               </w:rPr>
-              <w:t>Beheerblootstelling</w:t>
+              <w:t>Begrazingsblootstelling</w:t>
             </w:r>
           </w:p>
         </w:tc>
@@ -1057,7 +1034,7 @@
                 <w:color w:val="202124"/>
                 <w:sz w:val="18"/>
               </w:rPr>
-              <w:t>Wat op een locatie in een bepaalde periode feitelijk aan beheer plaatsvond.</w:t>
+              <w:t>Welke grazers op een locatie in een bepaalde periode feitelijk toegang hadden.</w:t>
             </w:r>
           </w:p>
         </w:tc>
@@ -1256,7 +1233,7 @@
                 <w:color w:val="202124"/>
                 <w:sz w:val="18"/>
               </w:rPr>
-              <w:t>Uitkomst</w:t>
+              <w:t>Beheergebeurtenis</w:t>
             </w:r>
           </w:p>
         </w:tc>
@@ -1281,7 +1258,7 @@
                 <w:color w:val="202124"/>
                 <w:sz w:val="18"/>
               </w:rPr>
-              <w:t>Ecologische respons, bijvoorbeeld vegetatiehoogte, bloemaanbod of vogeltrend.</w:t>
+              <w:t>Neutrale technische identiteit waarvan begrazing in dit concept het enige uitgewerkte subtype is.</w:t>
             </w:r>
           </w:p>
         </w:tc>
@@ -1312,7 +1289,7 @@
                 <w:color w:val="202124"/>
                 <w:sz w:val="18"/>
               </w:rPr>
-              <w:t>Contextfactor</w:t>
+              <w:t>Externe koppelsleutel</w:t>
             </w:r>
           </w:p>
         </w:tc>
@@ -1338,174 +1315,7 @@
                 <w:color w:val="202124"/>
                 <w:sz w:val="18"/>
               </w:rPr>
-              <w:t>Factor die de uitkomst mede kan verklaren, zoals droogte, konijnenstand of stikstofdepositie.</w:t>
-            </w:r>
-          </w:p>
-        </w:tc>
-      </w:tr>
-      <w:tr>
-        <w:trPr>
-          <w:cantSplit w:val="true"/>
-        </w:trPr>
-        <w:tc>
-          <w:tcPr>
-            <w:tcW w:type="dxa" w:w="2100"/>
-            <w:tcMar>
-              <w:top w:w="90" w:type="dxa"/>
-              <w:start w:w="120" w:type="dxa"/>
-              <w:bottom w:w="90" w:type="dxa"/>
-              <w:end w:w="120" w:type="dxa"/>
-            </w:tcMar>
-            <w:vAlign w:val="center"/>
-          </w:tcPr>
-          <w:p>
-            <w:pPr>
-              <w:spacing w:after="0" w:line="240" w:lineRule="auto"/>
-            </w:pPr>
-            <w:r>
-              <w:rPr>
-                <w:rFonts w:ascii="Arial" w:hAnsi="Arial"/>
-                <w:color w:val="202124"/>
-                <w:sz w:val="18"/>
-              </w:rPr>
-              <w:t>Controle</w:t>
-            </w:r>
-          </w:p>
-        </w:tc>
-        <w:tc>
-          <w:tcPr>
-            <w:tcW w:type="dxa" w:w="7260"/>
-            <w:tcMar>
-              <w:top w:w="90" w:type="dxa"/>
-              <w:start w:w="120" w:type="dxa"/>
-              <w:bottom w:w="90" w:type="dxa"/>
-              <w:end w:w="120" w:type="dxa"/>
-            </w:tcMar>
-            <w:vAlign w:val="center"/>
-          </w:tcPr>
-          <w:p>
-            <w:pPr>
-              <w:spacing w:after="0" w:line="240" w:lineRule="auto"/>
-            </w:pPr>
-            <w:r>
-              <w:rPr>
-                <w:rFonts w:ascii="Arial" w:hAnsi="Arial"/>
-                <w:color w:val="202124"/>
-                <w:sz w:val="18"/>
-              </w:rPr>
-              <w:t>Vergelijkbaar gebied zonder de onderzochte ingreep.</w:t>
-            </w:r>
-          </w:p>
-        </w:tc>
-      </w:tr>
-      <w:tr>
-        <w:trPr>
-          <w:cantSplit w:val="true"/>
-        </w:trPr>
-        <w:tc>
-          <w:tcPr>
-            <w:tcW w:type="dxa" w:w="2100"/>
-            <w:shd w:fill="F8FAFB"/>
-            <w:tcMar>
-              <w:top w:w="90" w:type="dxa"/>
-              <w:start w:w="120" w:type="dxa"/>
-              <w:bottom w:w="90" w:type="dxa"/>
-              <w:end w:w="120" w:type="dxa"/>
-            </w:tcMar>
-            <w:vAlign w:val="center"/>
-          </w:tcPr>
-          <w:p>
-            <w:pPr>
-              <w:spacing w:after="0" w:line="240" w:lineRule="auto"/>
-            </w:pPr>
-            <w:r>
-              <w:rPr>
-                <w:rFonts w:ascii="Arial" w:hAnsi="Arial"/>
-                <w:color w:val="202124"/>
-                <w:sz w:val="18"/>
-              </w:rPr>
-              <w:t>Referentie</w:t>
-            </w:r>
-          </w:p>
-        </w:tc>
-        <w:tc>
-          <w:tcPr>
-            <w:tcW w:type="dxa" w:w="7260"/>
-            <w:shd w:fill="F8FAFB"/>
-            <w:tcMar>
-              <w:top w:w="90" w:type="dxa"/>
-              <w:start w:w="120" w:type="dxa"/>
-              <w:bottom w:w="90" w:type="dxa"/>
-              <w:end w:w="120" w:type="dxa"/>
-            </w:tcMar>
-            <w:vAlign w:val="center"/>
-          </w:tcPr>
-          <w:p>
-            <w:pPr>
-              <w:spacing w:after="0" w:line="240" w:lineRule="auto"/>
-            </w:pPr>
-            <w:r>
-              <w:rPr>
-                <w:rFonts w:ascii="Arial" w:hAnsi="Arial"/>
-                <w:color w:val="202124"/>
-                <w:sz w:val="18"/>
-              </w:rPr>
-              <w:t>Gebied met een stabiel ander beheer, bijvoorbeeld continu begraasd bij een proef met wisselbegrazing.</w:t>
-            </w:r>
-          </w:p>
-        </w:tc>
-      </w:tr>
-      <w:tr>
-        <w:trPr>
-          <w:cantSplit w:val="true"/>
-        </w:trPr>
-        <w:tc>
-          <w:tcPr>
-            <w:tcW w:type="dxa" w:w="2100"/>
-            <w:tcMar>
-              <w:top w:w="90" w:type="dxa"/>
-              <w:start w:w="120" w:type="dxa"/>
-              <w:bottom w:w="90" w:type="dxa"/>
-              <w:end w:w="120" w:type="dxa"/>
-            </w:tcMar>
-            <w:vAlign w:val="center"/>
-          </w:tcPr>
-          <w:p>
-            <w:pPr>
-              <w:spacing w:after="0" w:line="240" w:lineRule="auto"/>
-            </w:pPr>
-            <w:r>
-              <w:rPr>
-                <w:rFonts w:ascii="Arial" w:hAnsi="Arial"/>
-                <w:color w:val="202124"/>
-                <w:sz w:val="18"/>
-              </w:rPr>
-              <w:t>BACI</w:t>
-            </w:r>
-          </w:p>
-        </w:tc>
-        <w:tc>
-          <w:tcPr>
-            <w:tcW w:type="dxa" w:w="7260"/>
-            <w:tcMar>
-              <w:top w:w="90" w:type="dxa"/>
-              <w:start w:w="120" w:type="dxa"/>
-              <w:bottom w:w="90" w:type="dxa"/>
-              <w:end w:w="120" w:type="dxa"/>
-            </w:tcMar>
-            <w:vAlign w:val="center"/>
-          </w:tcPr>
-          <w:p>
-            <w:pPr>
-              <w:spacing w:after="0" w:line="240" w:lineRule="auto"/>
-            </w:pPr>
-            <w:r>
-              <w:rPr>
-                <w:rFonts w:ascii="Arial" w:hAnsi="Arial"/>
-                <w:color w:val="202124"/>
-                <w:sz w:val="18"/>
-              </w:rPr>
-              <w:t>Before–After–Control–Impact: vóór en na meten in behandeld én vergelijkingsgebied.</w:t>
+              <w:t>Sleutel waarmee een ander systeem later naar gebied, periode of begrazingsrecord kan verwijzen.</w:t>
             </w:r>
           </w:p>
         </w:tc>
@@ -1597,8 +1407,8 @@
       <w:r>
         <w:drawing>
           <wp:inline xmlns:a="http://schemas.openxmlformats.org/drawingml/2006/main" xmlns:pic="http://schemas.openxmlformats.org/drawingml/2006/picture">
-            <wp:extent cx="8915400" cy="5850731"/>
-            <wp:docPr id="1" name="Picture 1" title="Conceptueel gegevensmodel begrazingsbeheer vanaf 2026" descr="Drie gekoppelde domeinen: gebied en beheer, begrazingsblootstelling, en evaluatie en context. Hoofdtabellen tonen primaire en vreemde sleutels en hun samenhang."/>
+            <wp:extent cx="8229600" cy="5657850"/>
+            <wp:docPr id="1" name="Picture 1" title="Conceptueel gegevensmodel begrazingsbeheer vanaf 2026" descr="Drie kolommen met ruimtelijke registratie, begrazing in de tijd en referentie- en detailgegevens. Iedere relatie eindigt met een pijlpunt op de rand van de betrokken tabel; geen lijn loopt door een tabel."/>
             <wp:cNvGraphicFramePr>
               <a:graphicFrameLocks noChangeAspect="1"/>
             </wp:cNvGraphicFramePr>
@@ -1618,7 +1428,7 @@
                   <pic:spPr>
                     <a:xfrm>
                       <a:off x="0" y="0"/>
-                      <a:ext cx="8915400" cy="5850731"/>
+                      <a:ext cx="8229600" cy="5657850"/>
                     </a:xfrm>
                     <a:prstGeom prst="rect"/>
                   </pic:spPr>
@@ -1669,7 +1479,7 @@
         <w:keepNext/>
       </w:pPr>
       <w:r>
-        <w:t>5.1 Gebied en beheer</w:t>
+        <w:t>5.1 Gebied en ruimtelijke geldigheid</w:t>
       </w:r>
     </w:p>
     <w:p>
@@ -1683,7 +1493,7 @@
           <w:color w:val="202124"/>
           <w:sz w:val="21"/>
         </w:rPr>
-        <w:t>Een beheergebied heeft een blijvende identiteit. De fysieke begrenzing staat in een afzonderlijke versie, zodat een rasterwijziging niet de historische situatie overschrijft. Iedere maatregel krijgt een werkelijk geraakt vlak; daardoor kunnen maaien, plaggen, exclosures en andere ingrepen later met dezelfde ruimtelijke logica worden gekoppeld.</w:t>
+        <w:t>Een beheergebied heeft een blijvende identiteit. De fysieke begrenzing staat in een afzonderlijke versie, zodat een grens- of rasterwijziging de historische situatie niet overschrijft. Het begrazingsgebied legt vast welk vlak binnen die versie feitelijk aan de begrazingsperiode was gekoppeld.</w:t>
       </w:r>
     </w:p>
     <w:p>
@@ -1715,7 +1525,7 @@
         <w:keepNext/>
       </w:pPr>
       <w:r>
-        <w:t>5.3 Evaluatie en context</w:t>
+        <w:t>5.3 Technisch koppelvlak voor later</w:t>
       </w:r>
     </w:p>
     <w:p>
@@ -1729,7 +1539,7 @@
           <w:color w:val="202124"/>
           <w:sz w:val="21"/>
         </w:rPr>
-        <w:t>Meetlocaties hebben een stabiele code en één of meer geometrische versies. Meetbezoeken verwijzen naar de geldige versie en de gebruikte protocolversie. Vergelijkingsopzetten geven aan welke gebieden behandeld, controle of referentie zijn. Wilde grazers, weer, stikstof en standplaatskenmerken zijn koppelbare contextreeksen.</w:t>
+        <w:t>Het model neemt nu geen ecologische meetreeksen en geen andere inhoudelijke beheertypen op. Latere systemen kunnen wel aansluiten via stabiele gebiedscodes, geometrieën, begin- en eindtijden en externe sleutels. De neutrale beheergebeurtenis voorkomt dat daarvoor de begrazingstabellen moeten worden verbouwd.</w:t>
       </w:r>
     </w:p>
     <w:p>
@@ -1761,7 +1571,7 @@
         <w:keepNext/>
       </w:pPr>
       <w:r>
-        <w:t>6.1 Gebied en generiek beheer</w:t>
+        <w:t>6.1 Gebied en neutrale basis</w:t>
       </w:r>
     </w:p>
     <w:tbl>
@@ -2774,7 +2584,7 @@
                 <w:color w:val="202124"/>
                 <w:sz w:val="16"/>
               </w:rPr>
-              <w:t>maatregeltype</w:t>
+              <w:t>beheergebeurtenis</w:t>
             </w:r>
           </w:p>
         </w:tc>
@@ -2799,7 +2609,7 @@
                 <w:color w:val="202124"/>
                 <w:sz w:val="16"/>
               </w:rPr>
-              <w:t>maatregeltype_id, code, naam</w:t>
+              <w:t>gebeurtenis_id</w:t>
             </w:r>
           </w:p>
         </w:tc>
@@ -2824,7 +2634,7 @@
                 <w:color w:val="202124"/>
                 <w:sz w:val="16"/>
               </w:rPr>
-              <w:t>PK + UK</w:t>
+              <w:t>PK</w:t>
             </w:r>
           </w:p>
         </w:tc>
@@ -2849,7 +2659,7 @@
                 <w:color w:val="202124"/>
                 <w:sz w:val="16"/>
               </w:rPr>
-              <w:t>Beheerde lijst: begrazen, maaien, plaggen, exclosure enz.</w:t>
+              <w:t>Neutrale identiteit; alleen begrazing wordt nu uitgewerkt.</w:t>
             </w:r>
           </w:p>
         </w:tc>
@@ -2880,221 +2690,7 @@
                 <w:color w:val="202124"/>
                 <w:sz w:val="16"/>
               </w:rPr>
-              <w:t>beheermaatregel</w:t>
-            </w:r>
-          </w:p>
-        </w:tc>
-        <w:tc>
-          <w:tcPr>
-            <w:tcW w:type="dxa" w:w="2550"/>
-            <w:shd w:fill="F8FAFB"/>
-            <w:tcMar>
-              <w:top w:w="90" w:type="dxa"/>
-              <w:start w:w="120" w:type="dxa"/>
-              <w:bottom w:w="90" w:type="dxa"/>
-              <w:end w:w="120" w:type="dxa"/>
-            </w:tcMar>
-            <w:vAlign w:val="center"/>
-          </w:tcPr>
-          <w:p>
-            <w:pPr>
-              <w:spacing w:after="0" w:line="240" w:lineRule="auto"/>
-            </w:pPr>
-            <w:r>
-              <w:rPr>
-                <w:rFonts w:ascii="Arial" w:hAnsi="Arial"/>
-                <w:color w:val="202124"/>
-                <w:sz w:val="16"/>
-              </w:rPr>
-              <w:t>maatregel_id</w:t>
-            </w:r>
-          </w:p>
-        </w:tc>
-        <w:tc>
-          <w:tcPr>
-            <w:tcW w:type="dxa" w:w="1900"/>
-            <w:shd w:fill="F8FAFB"/>
-            <w:tcMar>
-              <w:top w:w="90" w:type="dxa"/>
-              <w:start w:w="120" w:type="dxa"/>
-              <w:bottom w:w="90" w:type="dxa"/>
-              <w:end w:w="120" w:type="dxa"/>
-            </w:tcMar>
-            <w:vAlign w:val="center"/>
-          </w:tcPr>
-          <w:p>
-            <w:pPr>
-              <w:spacing w:after="0" w:line="240" w:lineRule="auto"/>
-            </w:pPr>
-            <w:r>
-              <w:rPr>
-                <w:rFonts w:ascii="Arial" w:hAnsi="Arial"/>
-                <w:color w:val="202124"/>
-                <w:sz w:val="16"/>
-              </w:rPr>
-              <w:t>PK</w:t>
-            </w:r>
-          </w:p>
-        </w:tc>
-        <w:tc>
-          <w:tcPr>
-            <w:tcW w:type="dxa" w:w="3210"/>
-            <w:shd w:fill="F8FAFB"/>
-            <w:tcMar>
-              <w:top w:w="90" w:type="dxa"/>
-              <w:start w:w="120" w:type="dxa"/>
-              <w:bottom w:w="90" w:type="dxa"/>
-              <w:end w:w="120" w:type="dxa"/>
-            </w:tcMar>
-            <w:vAlign w:val="center"/>
-          </w:tcPr>
-          <w:p>
-            <w:pPr>
-              <w:spacing w:after="0" w:line="240" w:lineRule="auto"/>
-            </w:pPr>
-            <w:r>
-              <w:rPr>
-                <w:rFonts w:ascii="Arial" w:hAnsi="Arial"/>
-                <w:color w:val="202124"/>
-                <w:sz w:val="16"/>
-              </w:rPr>
-              <w:t>Eén geplande of werkelijke ingreep.</w:t>
-            </w:r>
-          </w:p>
-        </w:tc>
-      </w:tr>
-      <w:tr>
-        <w:trPr>
-          <w:cantSplit w:val="true"/>
-        </w:trPr>
-        <w:tc>
-          <w:tcPr>
-            <w:tcW w:type="dxa" w:w="1700"/>
-            <w:tcMar>
-              <w:top w:w="90" w:type="dxa"/>
-              <w:start w:w="120" w:type="dxa"/>
-              <w:bottom w:w="90" w:type="dxa"/>
-              <w:end w:w="120" w:type="dxa"/>
-            </w:tcMar>
-            <w:vAlign w:val="center"/>
-          </w:tcPr>
-          <w:p>
-            <w:pPr>
-              <w:spacing w:after="0" w:line="240" w:lineRule="auto"/>
-            </w:pPr>
-            <w:r>
-              <w:rPr>
-                <w:rFonts w:ascii="Arial" w:hAnsi="Arial"/>
-                <w:color w:val="202124"/>
-                <w:sz w:val="16"/>
-              </w:rPr>
-              <w:t>beheermaatregel</w:t>
-            </w:r>
-          </w:p>
-        </w:tc>
-        <w:tc>
-          <w:tcPr>
-            <w:tcW w:type="dxa" w:w="2550"/>
-            <w:tcMar>
-              <w:top w:w="90" w:type="dxa"/>
-              <w:start w:w="120" w:type="dxa"/>
-              <w:bottom w:w="90" w:type="dxa"/>
-              <w:end w:w="120" w:type="dxa"/>
-            </w:tcMar>
-            <w:vAlign w:val="center"/>
-          </w:tcPr>
-          <w:p>
-            <w:pPr>
-              <w:spacing w:after="0" w:line="240" w:lineRule="auto"/>
-            </w:pPr>
-            <w:r>
-              <w:rPr>
-                <w:rFonts w:ascii="Arial" w:hAnsi="Arial"/>
-                <w:color w:val="202124"/>
-                <w:sz w:val="16"/>
-              </w:rPr>
-              <w:t>maatregeltype_id</w:t>
-            </w:r>
-          </w:p>
-        </w:tc>
-        <w:tc>
-          <w:tcPr>
-            <w:tcW w:type="dxa" w:w="1900"/>
-            <w:tcMar>
-              <w:top w:w="90" w:type="dxa"/>
-              <w:start w:w="120" w:type="dxa"/>
-              <w:bottom w:w="90" w:type="dxa"/>
-              <w:end w:w="120" w:type="dxa"/>
-            </w:tcMar>
-            <w:vAlign w:val="center"/>
-          </w:tcPr>
-          <w:p>
-            <w:pPr>
-              <w:spacing w:after="0" w:line="240" w:lineRule="auto"/>
-            </w:pPr>
-            <w:r>
-              <w:rPr>
-                <w:rFonts w:ascii="Arial" w:hAnsi="Arial"/>
-                <w:color w:val="202124"/>
-                <w:sz w:val="16"/>
-              </w:rPr>
-              <w:t>FK → maatregeltype</w:t>
-            </w:r>
-          </w:p>
-        </w:tc>
-        <w:tc>
-          <w:tcPr>
-            <w:tcW w:type="dxa" w:w="3210"/>
-            <w:tcMar>
-              <w:top w:w="90" w:type="dxa"/>
-              <w:start w:w="120" w:type="dxa"/>
-              <w:bottom w:w="90" w:type="dxa"/>
-              <w:end w:w="120" w:type="dxa"/>
-            </w:tcMar>
-            <w:vAlign w:val="center"/>
-          </w:tcPr>
-          <w:p>
-            <w:pPr>
-              <w:spacing w:after="0" w:line="240" w:lineRule="auto"/>
-            </w:pPr>
-            <w:r>
-              <w:rPr>
-                <w:rFonts w:ascii="Arial" w:hAnsi="Arial"/>
-                <w:color w:val="202124"/>
-                <w:sz w:val="16"/>
-              </w:rPr>
-              <w:t>Classificatie van de ingreep.</w:t>
-            </w:r>
-          </w:p>
-        </w:tc>
-      </w:tr>
-      <w:tr>
-        <w:trPr>
-          <w:cantSplit w:val="true"/>
-        </w:trPr>
-        <w:tc>
-          <w:tcPr>
-            <w:tcW w:type="dxa" w:w="1700"/>
-            <w:shd w:fill="F8FAFB"/>
-            <w:tcMar>
-              <w:top w:w="90" w:type="dxa"/>
-              <w:start w:w="120" w:type="dxa"/>
-              <w:bottom w:w="90" w:type="dxa"/>
-              <w:end w:w="120" w:type="dxa"/>
-            </w:tcMar>
-            <w:vAlign w:val="center"/>
-          </w:tcPr>
-          <w:p>
-            <w:pPr>
-              <w:spacing w:after="0" w:line="240" w:lineRule="auto"/>
-            </w:pPr>
-            <w:r>
-              <w:rPr>
-                <w:rFonts w:ascii="Arial" w:hAnsi="Arial"/>
-                <w:color w:val="202124"/>
-                <w:sz w:val="16"/>
-              </w:rPr>
-              <w:t>beheermaatregel</w:t>
+              <w:t>beheergebeurtenis</w:t>
             </w:r>
           </w:p>
         </w:tc>
@@ -3202,7 +2798,7 @@
                 <w:color w:val="202124"/>
                 <w:sz w:val="16"/>
               </w:rPr>
-              <w:t>beheermaatregel</w:t>
+              <w:t>beheergebeurtenis</w:t>
             </w:r>
           </w:p>
         </w:tc>
@@ -3227,7 +2823,7 @@
                 <w:color w:val="202124"/>
                 <w:sz w:val="16"/>
               </w:rPr>
-              <w:t>begin_tijd, eind_tijd, doel, status</w:t>
+              <w:t>doel, status, bron</w:t>
             </w:r>
           </w:p>
         </w:tc>
@@ -3277,7 +2873,7 @@
                 <w:color w:val="202124"/>
                 <w:sz w:val="16"/>
               </w:rPr>
-              <w:t>Tijdvak, beheerdoel en uitvoeringsstatus.</w:t>
+              <w:t>Doel, uitvoeringsstatus en herkomst.</w:t>
             </w:r>
           </w:p>
         </w:tc>
@@ -3308,7 +2904,7 @@
                 <w:color w:val="202124"/>
                 <w:sz w:val="16"/>
               </w:rPr>
-              <w:t>maatregelgebied</w:t>
+              <w:t>begrazingsgebied</w:t>
             </w:r>
           </w:p>
         </w:tc>
@@ -3334,7 +2930,7 @@
                 <w:color w:val="202124"/>
                 <w:sz w:val="16"/>
               </w:rPr>
-              <w:t>maatregelgebied_id</w:t>
+              <w:t>begrazingsgebied_id</w:t>
             </w:r>
           </w:p>
         </w:tc>
@@ -3386,7 +2982,7 @@
                 <w:color w:val="202124"/>
                 <w:sz w:val="16"/>
               </w:rPr>
-              <w:t>Ruimtelijke uitvoeringseenheid.</w:t>
+              <w:t>Ruimtelijke koppeling van een begrazingsperiode.</w:t>
             </w:r>
           </w:p>
         </w:tc>
@@ -3416,7 +3012,7 @@
                 <w:color w:val="202124"/>
                 <w:sz w:val="16"/>
               </w:rPr>
-              <w:t>maatregelgebied</w:t>
+              <w:t>begrazingsgebied</w:t>
             </w:r>
           </w:p>
         </w:tc>
@@ -3441,7 +3037,7 @@
                 <w:color w:val="202124"/>
                 <w:sz w:val="16"/>
               </w:rPr>
-              <w:t>maatregel_id, gebiedsversie_id</w:t>
+              <w:t>gebeurtenis_id, gebiedsversie_id</w:t>
             </w:r>
           </w:p>
         </w:tc>
@@ -3491,7 +3087,7 @@
                 <w:color w:val="202124"/>
                 <w:sz w:val="16"/>
               </w:rPr>
-              <w:t>N:M-koppeling tussen maatregel en gebiedsversie.</w:t>
+              <w:t>N:M-koppeling tussen periode en gebiedsversie.</w:t>
             </w:r>
           </w:p>
         </w:tc>
@@ -3522,7 +3118,7 @@
                 <w:color w:val="202124"/>
                 <w:sz w:val="16"/>
               </w:rPr>
-              <w:t>maatregelgebied</w:t>
+              <w:t>begrazingsgebied</w:t>
             </w:r>
           </w:p>
         </w:tc>
@@ -3600,7 +3196,7 @@
                 <w:color w:val="202124"/>
                 <w:sz w:val="16"/>
               </w:rPr>
-              <w:t>Exact geraakt vlak; mag kleiner zijn dan gebiedsversie.</w:t>
+              <w:t>Feitelijk toegankelijk hoofdvlak; kan kleiner zijn dan gebiedsversie.</w:t>
             </w:r>
           </w:p>
         </w:tc>
@@ -3799,7 +3395,7 @@
                 <w:color w:val="202124"/>
                 <w:sz w:val="16"/>
               </w:rPr>
-              <w:t>maatregel_id</w:t>
+              <w:t>gebeurtenis_id</w:t>
             </w:r>
           </w:p>
         </w:tc>
@@ -3824,7 +3420,7 @@
                 <w:color w:val="202124"/>
                 <w:sz w:val="16"/>
               </w:rPr>
-              <w:t>PK + FK → beheermaatregel</w:t>
+              <w:t>PK + FK → beheergebeurtenis</w:t>
             </w:r>
           </w:p>
         </w:tc>
@@ -3849,7 +3445,7 @@
                 <w:color w:val="202124"/>
                 <w:sz w:val="16"/>
               </w:rPr>
-              <w:t>Subtype van beheermaatregel.</w:t>
+              <w:t>Begrazing is het enige nu uitgewerkte subtype.</w:t>
             </w:r>
           </w:p>
         </w:tc>
@@ -4120,7 +3716,7 @@
                 <w:color w:val="202124"/>
                 <w:sz w:val="16"/>
               </w:rPr>
-              <w:t>fase_id, maatregel_id</w:t>
+              <w:t>fase_id, gebeurtenis_id</w:t>
             </w:r>
           </w:p>
         </w:tc>
@@ -6469,7 +6065,7 @@
         <w:keepNext/>
       </w:pPr>
       <w:r>
-        <w:t>6.4 Vergelijkingsopzet en monitoring</w:t>
+        <w:t>6.4 Neutraal koppelvlak voor toekomstige verbindingen</w:t>
       </w:r>
     </w:p>
     <w:tbl>
@@ -6626,7 +6222,7 @@
                 <w:color w:val="202124"/>
                 <w:sz w:val="16"/>
               </w:rPr>
-              <w:t>vergelijkingsopzet</w:t>
+              <w:t>externe_koppeling</w:t>
             </w:r>
           </w:p>
         </w:tc>
@@ -6651,7 +6247,7 @@
                 <w:color w:val="202124"/>
                 <w:sz w:val="16"/>
               </w:rPr>
-              <w:t>vergelijkingsopzet_id</w:t>
+              <w:t>koppeling_id</w:t>
             </w:r>
           </w:p>
         </w:tc>
@@ -6701,7 +6297,7 @@
                 <w:color w:val="202124"/>
                 <w:sz w:val="16"/>
               </w:rPr>
-              <w:t>Eén evaluatieontwerp.</w:t>
+              <w:t>Technische verwijzing; bevat geen externe inhoud.</w:t>
             </w:r>
           </w:p>
         </w:tc>
@@ -6732,7 +6328,7 @@
                 <w:color w:val="202124"/>
                 <w:sz w:val="16"/>
               </w:rPr>
-              <w:t>vergelijkingsopzet</w:t>
+              <w:t>externe_koppeling</w:t>
             </w:r>
           </w:p>
         </w:tc>
@@ -6758,7 +6354,7 @@
                 <w:color w:val="202124"/>
                 <w:sz w:val="16"/>
               </w:rPr>
-              <w:t>opzet_type, evaluatievraag, begin/eind</w:t>
+              <w:t>entiteitstype, entiteit_id</w:t>
             </w:r>
           </w:p>
         </w:tc>
@@ -6810,7 +6406,7 @@
                 <w:color w:val="202124"/>
                 <w:sz w:val="16"/>
               </w:rPr>
-              <w:t>BACI, voor-na, gepaard of alleen trend.</w:t>
+              <w:t>Verwijst naar beheergebied, gebiedsversie, periode of fase.</w:t>
             </w:r>
           </w:p>
         </w:tc>
@@ -6840,7 +6436,7 @@
                 <w:color w:val="202124"/>
                 <w:sz w:val="16"/>
               </w:rPr>
-              <w:t>vergelijkingsgebied</w:t>
+              <w:t>externe_koppeling</w:t>
             </w:r>
           </w:p>
         </w:tc>
@@ -6865,7 +6461,7 @@
                 <w:color w:val="202124"/>
                 <w:sz w:val="16"/>
               </w:rPr>
-              <w:t>rol_id, opzet_id, gebiedsversie_id</w:t>
+              <w:t>bronsysteem, externe_sleutel</w:t>
             </w:r>
           </w:p>
         </w:tc>
@@ -6890,7 +6486,7 @@
                 <w:color w:val="202124"/>
                 <w:sz w:val="16"/>
               </w:rPr>
-              <w:t>PK + FK</w:t>
+              <w:t>UK per bronsysteem</w:t>
             </w:r>
           </w:p>
         </w:tc>
@@ -6915,7 +6511,7 @@
                 <w:color w:val="202124"/>
                 <w:sz w:val="16"/>
               </w:rPr>
-              <w:t>Gebied krijgt rol binnen één opzet.</w:t>
+              <w:t>Maakt latere aansluiting mogelijk zonder bronsleutels in kerntabellen.</w:t>
             </w:r>
           </w:p>
         </w:tc>
@@ -6946,7 +6542,7 @@
                 <w:color w:val="202124"/>
                 <w:sz w:val="16"/>
               </w:rPr>
-              <w:t>vergelijkingsgebied</w:t>
+              <w:t>externe_koppeling</w:t>
             </w:r>
           </w:p>
         </w:tc>
@@ -6972,7 +6568,7 @@
                 <w:color w:val="202124"/>
                 <w:sz w:val="16"/>
               </w:rPr>
-              <w:t>rol_code, geldig_van/tot</w:t>
+              <w:t>geldig_van/tot, bron, status</w:t>
             </w:r>
           </w:p>
         </w:tc>
@@ -6998,7 +6594,7 @@
                 <w:color w:val="202124"/>
                 <w:sz w:val="16"/>
               </w:rPr>
-              <w:t>verplicht</w:t>
+              <w:t>verplicht/optioneel</w:t>
             </w:r>
           </w:p>
         </w:tc>
@@ -7024,2077 +6620,7 @@
                 <w:color w:val="202124"/>
                 <w:sz w:val="16"/>
               </w:rPr>
-              <w:t>Behandeling, onbegraasde controle of beheerde referentie.</w:t>
-            </w:r>
-          </w:p>
-        </w:tc>
-      </w:tr>
-      <w:tr>
-        <w:trPr>
-          <w:cantSplit w:val="true"/>
-        </w:trPr>
-        <w:tc>
-          <w:tcPr>
-            <w:tcW w:type="dxa" w:w="1700"/>
-            <w:tcMar>
-              <w:top w:w="90" w:type="dxa"/>
-              <w:start w:w="120" w:type="dxa"/>
-              <w:bottom w:w="90" w:type="dxa"/>
-              <w:end w:w="120" w:type="dxa"/>
-            </w:tcMar>
-            <w:vAlign w:val="center"/>
-          </w:tcPr>
-          <w:p>
-            <w:pPr>
-              <w:spacing w:after="0" w:line="240" w:lineRule="auto"/>
-            </w:pPr>
-            <w:r>
-              <w:rPr>
-                <w:rFonts w:ascii="Arial" w:hAnsi="Arial"/>
-                <w:color w:val="202124"/>
-                <w:sz w:val="16"/>
-              </w:rPr>
-              <w:t>monitoringprogramma</w:t>
-            </w:r>
-          </w:p>
-        </w:tc>
-        <w:tc>
-          <w:tcPr>
-            <w:tcW w:type="dxa" w:w="2550"/>
-            <w:tcMar>
-              <w:top w:w="90" w:type="dxa"/>
-              <w:start w:w="120" w:type="dxa"/>
-              <w:bottom w:w="90" w:type="dxa"/>
-              <w:end w:w="120" w:type="dxa"/>
-            </w:tcMar>
-            <w:vAlign w:val="center"/>
-          </w:tcPr>
-          <w:p>
-            <w:pPr>
-              <w:spacing w:after="0" w:line="240" w:lineRule="auto"/>
-            </w:pPr>
-            <w:r>
-              <w:rPr>
-                <w:rFonts w:ascii="Arial" w:hAnsi="Arial"/>
-                <w:color w:val="202124"/>
-                <w:sz w:val="16"/>
-              </w:rPr>
-              <w:t>programma_id, naam, doel</w:t>
-            </w:r>
-          </w:p>
-        </w:tc>
-        <w:tc>
-          <w:tcPr>
-            <w:tcW w:type="dxa" w:w="1900"/>
-            <w:tcMar>
-              <w:top w:w="90" w:type="dxa"/>
-              <w:start w:w="120" w:type="dxa"/>
-              <w:bottom w:w="90" w:type="dxa"/>
-              <w:end w:w="120" w:type="dxa"/>
-            </w:tcMar>
-            <w:vAlign w:val="center"/>
-          </w:tcPr>
-          <w:p>
-            <w:pPr>
-              <w:spacing w:after="0" w:line="240" w:lineRule="auto"/>
-            </w:pPr>
-            <w:r>
-              <w:rPr>
-                <w:rFonts w:ascii="Arial" w:hAnsi="Arial"/>
-                <w:color w:val="202124"/>
-                <w:sz w:val="16"/>
-              </w:rPr>
-              <w:t>PK</w:t>
-            </w:r>
-          </w:p>
-        </w:tc>
-        <w:tc>
-          <w:tcPr>
-            <w:tcW w:type="dxa" w:w="3210"/>
-            <w:tcMar>
-              <w:top w:w="90" w:type="dxa"/>
-              <w:start w:w="120" w:type="dxa"/>
-              <w:bottom w:w="90" w:type="dxa"/>
-              <w:end w:w="120" w:type="dxa"/>
-            </w:tcMar>
-            <w:vAlign w:val="center"/>
-          </w:tcPr>
-          <w:p>
-            <w:pPr>
-              <w:spacing w:after="0" w:line="240" w:lineRule="auto"/>
-            </w:pPr>
-            <w:r>
-              <w:rPr>
-                <w:rFonts w:ascii="Arial" w:hAnsi="Arial"/>
-                <w:color w:val="202124"/>
-                <w:sz w:val="16"/>
-              </w:rPr>
-              <w:t>Bijvoorbeeld BMP, PQ, konijnentransect of vegetatiestructuur.</w:t>
-            </w:r>
-          </w:p>
-        </w:tc>
-      </w:tr>
-      <w:tr>
-        <w:trPr>
-          <w:cantSplit w:val="true"/>
-        </w:trPr>
-        <w:tc>
-          <w:tcPr>
-            <w:tcW w:type="dxa" w:w="1700"/>
-            <w:shd w:fill="F8FAFB"/>
-            <w:tcMar>
-              <w:top w:w="90" w:type="dxa"/>
-              <w:start w:w="120" w:type="dxa"/>
-              <w:bottom w:w="90" w:type="dxa"/>
-              <w:end w:w="120" w:type="dxa"/>
-            </w:tcMar>
-            <w:vAlign w:val="center"/>
-          </w:tcPr>
-          <w:p>
-            <w:pPr>
-              <w:spacing w:after="0" w:line="240" w:lineRule="auto"/>
-            </w:pPr>
-            <w:r>
-              <w:rPr>
-                <w:rFonts w:ascii="Arial" w:hAnsi="Arial"/>
-                <w:color w:val="202124"/>
-                <w:sz w:val="16"/>
-              </w:rPr>
-              <w:t>monitoringprogramma</w:t>
-            </w:r>
-          </w:p>
-        </w:tc>
-        <w:tc>
-          <w:tcPr>
-            <w:tcW w:type="dxa" w:w="2550"/>
-            <w:shd w:fill="F8FAFB"/>
-            <w:tcMar>
-              <w:top w:w="90" w:type="dxa"/>
-              <w:start w:w="120" w:type="dxa"/>
-              <w:bottom w:w="90" w:type="dxa"/>
-              <w:end w:w="120" w:type="dxa"/>
-            </w:tcMar>
-            <w:vAlign w:val="center"/>
-          </w:tcPr>
-          <w:p>
-            <w:pPr>
-              <w:spacing w:after="0" w:line="240" w:lineRule="auto"/>
-            </w:pPr>
-            <w:r>
-              <w:rPr>
-                <w:rFonts w:ascii="Arial" w:hAnsi="Arial"/>
-                <w:color w:val="202124"/>
-                <w:sz w:val="16"/>
-              </w:rPr>
-              <w:t>protocol_code, protocolversie, bron</w:t>
-            </w:r>
-          </w:p>
-        </w:tc>
-        <w:tc>
-          <w:tcPr>
-            <w:tcW w:type="dxa" w:w="1900"/>
-            <w:shd w:fill="F8FAFB"/>
-            <w:tcMar>
-              <w:top w:w="90" w:type="dxa"/>
-              <w:start w:w="120" w:type="dxa"/>
-              <w:bottom w:w="90" w:type="dxa"/>
-              <w:end w:w="120" w:type="dxa"/>
-            </w:tcMar>
-            <w:vAlign w:val="center"/>
-          </w:tcPr>
-          <w:p>
-            <w:pPr>
-              <w:spacing w:after="0" w:line="240" w:lineRule="auto"/>
-            </w:pPr>
-            <w:r>
-              <w:rPr>
-                <w:rFonts w:ascii="Arial" w:hAnsi="Arial"/>
-                <w:color w:val="202124"/>
-                <w:sz w:val="16"/>
-              </w:rPr>
-              <w:t>verplicht</w:t>
-            </w:r>
-          </w:p>
-        </w:tc>
-        <w:tc>
-          <w:tcPr>
-            <w:tcW w:type="dxa" w:w="3210"/>
-            <w:shd w:fill="F8FAFB"/>
-            <w:tcMar>
-              <w:top w:w="90" w:type="dxa"/>
-              <w:start w:w="120" w:type="dxa"/>
-              <w:bottom w:w="90" w:type="dxa"/>
-              <w:end w:w="120" w:type="dxa"/>
-            </w:tcMar>
-            <w:vAlign w:val="center"/>
-          </w:tcPr>
-          <w:p>
-            <w:pPr>
-              <w:spacing w:after="0" w:line="240" w:lineRule="auto"/>
-            </w:pPr>
-            <w:r>
-              <w:rPr>
-                <w:rFonts w:ascii="Arial" w:hAnsi="Arial"/>
-                <w:color w:val="202124"/>
-                <w:sz w:val="16"/>
-              </w:rPr>
-              <w:t>Methodewijzigingen expliciet versieerbaar.</w:t>
-            </w:r>
-          </w:p>
-        </w:tc>
-      </w:tr>
-      <w:tr>
-        <w:trPr>
-          <w:cantSplit w:val="true"/>
-        </w:trPr>
-        <w:tc>
-          <w:tcPr>
-            <w:tcW w:type="dxa" w:w="1700"/>
-            <w:tcMar>
-              <w:top w:w="90" w:type="dxa"/>
-              <w:start w:w="120" w:type="dxa"/>
-              <w:bottom w:w="90" w:type="dxa"/>
-              <w:end w:w="120" w:type="dxa"/>
-            </w:tcMar>
-            <w:vAlign w:val="center"/>
-          </w:tcPr>
-          <w:p>
-            <w:pPr>
-              <w:spacing w:after="0" w:line="240" w:lineRule="auto"/>
-            </w:pPr>
-            <w:r>
-              <w:rPr>
-                <w:rFonts w:ascii="Arial" w:hAnsi="Arial"/>
-                <w:color w:val="202124"/>
-                <w:sz w:val="16"/>
-              </w:rPr>
-              <w:t>meetlocatie</w:t>
-            </w:r>
-          </w:p>
-        </w:tc>
-        <w:tc>
-          <w:tcPr>
-            <w:tcW w:type="dxa" w:w="2550"/>
-            <w:tcMar>
-              <w:top w:w="90" w:type="dxa"/>
-              <w:start w:w="120" w:type="dxa"/>
-              <w:bottom w:w="90" w:type="dxa"/>
-              <w:end w:w="120" w:type="dxa"/>
-            </w:tcMar>
-            <w:vAlign w:val="center"/>
-          </w:tcPr>
-          <w:p>
-            <w:pPr>
-              <w:spacing w:after="0" w:line="240" w:lineRule="auto"/>
-            </w:pPr>
-            <w:r>
-              <w:rPr>
-                <w:rFonts w:ascii="Arial" w:hAnsi="Arial"/>
-                <w:color w:val="202124"/>
-                <w:sz w:val="16"/>
-              </w:rPr>
-              <w:t>meetlocatie_id, stabiele_code</w:t>
-            </w:r>
-          </w:p>
-        </w:tc>
-        <w:tc>
-          <w:tcPr>
-            <w:tcW w:type="dxa" w:w="1900"/>
-            <w:tcMar>
-              <w:top w:w="90" w:type="dxa"/>
-              <w:start w:w="120" w:type="dxa"/>
-              <w:bottom w:w="90" w:type="dxa"/>
-              <w:end w:w="120" w:type="dxa"/>
-            </w:tcMar>
-            <w:vAlign w:val="center"/>
-          </w:tcPr>
-          <w:p>
-            <w:pPr>
-              <w:spacing w:after="0" w:line="240" w:lineRule="auto"/>
-            </w:pPr>
-            <w:r>
-              <w:rPr>
-                <w:rFonts w:ascii="Arial" w:hAnsi="Arial"/>
-                <w:color w:val="202124"/>
-                <w:sz w:val="16"/>
-              </w:rPr>
-              <w:t>PK + UK</w:t>
-            </w:r>
-          </w:p>
-        </w:tc>
-        <w:tc>
-          <w:tcPr>
-            <w:tcW w:type="dxa" w:w="3210"/>
-            <w:tcMar>
-              <w:top w:w="90" w:type="dxa"/>
-              <w:start w:w="120" w:type="dxa"/>
-              <w:bottom w:w="90" w:type="dxa"/>
-              <w:end w:w="120" w:type="dxa"/>
-            </w:tcMar>
-            <w:vAlign w:val="center"/>
-          </w:tcPr>
-          <w:p>
-            <w:pPr>
-              <w:spacing w:after="0" w:line="240" w:lineRule="auto"/>
-            </w:pPr>
-            <w:r>
-              <w:rPr>
-                <w:rFonts w:ascii="Arial" w:hAnsi="Arial"/>
-                <w:color w:val="202124"/>
-                <w:sz w:val="16"/>
-              </w:rPr>
-              <w:t>Blijvende identiteit van plot, transect, kavel of rastercel.</w:t>
-            </w:r>
-          </w:p>
-        </w:tc>
-      </w:tr>
-      <w:tr>
-        <w:trPr>
-          <w:cantSplit w:val="true"/>
-        </w:trPr>
-        <w:tc>
-          <w:tcPr>
-            <w:tcW w:type="dxa" w:w="1700"/>
-            <w:shd w:fill="F8FAFB"/>
-            <w:tcMar>
-              <w:top w:w="90" w:type="dxa"/>
-              <w:start w:w="120" w:type="dxa"/>
-              <w:bottom w:w="90" w:type="dxa"/>
-              <w:end w:w="120" w:type="dxa"/>
-            </w:tcMar>
-            <w:vAlign w:val="center"/>
-          </w:tcPr>
-          <w:p>
-            <w:pPr>
-              <w:spacing w:after="0" w:line="240" w:lineRule="auto"/>
-            </w:pPr>
-            <w:r>
-              <w:rPr>
-                <w:rFonts w:ascii="Arial" w:hAnsi="Arial"/>
-                <w:color w:val="202124"/>
-                <w:sz w:val="16"/>
-              </w:rPr>
-              <w:t>meetlocatie</w:t>
-            </w:r>
-          </w:p>
-        </w:tc>
-        <w:tc>
-          <w:tcPr>
-            <w:tcW w:type="dxa" w:w="2550"/>
-            <w:shd w:fill="F8FAFB"/>
-            <w:tcMar>
-              <w:top w:w="90" w:type="dxa"/>
-              <w:start w:w="120" w:type="dxa"/>
-              <w:bottom w:w="90" w:type="dxa"/>
-              <w:end w:w="120" w:type="dxa"/>
-            </w:tcMar>
-            <w:vAlign w:val="center"/>
-          </w:tcPr>
-          <w:p>
-            <w:pPr>
-              <w:spacing w:after="0" w:line="240" w:lineRule="auto"/>
-            </w:pPr>
-            <w:r>
-              <w:rPr>
-                <w:rFonts w:ascii="Arial" w:hAnsi="Arial"/>
-                <w:color w:val="202124"/>
-                <w:sz w:val="16"/>
-              </w:rPr>
-              <w:t>programma_id, beheergebied_id</w:t>
-            </w:r>
-          </w:p>
-        </w:tc>
-        <w:tc>
-          <w:tcPr>
-            <w:tcW w:type="dxa" w:w="1900"/>
-            <w:shd w:fill="F8FAFB"/>
-            <w:tcMar>
-              <w:top w:w="90" w:type="dxa"/>
-              <w:start w:w="120" w:type="dxa"/>
-              <w:bottom w:w="90" w:type="dxa"/>
-              <w:end w:w="120" w:type="dxa"/>
-            </w:tcMar>
-            <w:vAlign w:val="center"/>
-          </w:tcPr>
-          <w:p>
-            <w:pPr>
-              <w:spacing w:after="0" w:line="240" w:lineRule="auto"/>
-            </w:pPr>
-            <w:r>
-              <w:rPr>
-                <w:rFonts w:ascii="Arial" w:hAnsi="Arial"/>
-                <w:color w:val="202124"/>
-                <w:sz w:val="16"/>
-              </w:rPr>
-              <w:t>FK</w:t>
-            </w:r>
-          </w:p>
-        </w:tc>
-        <w:tc>
-          <w:tcPr>
-            <w:tcW w:type="dxa" w:w="3210"/>
-            <w:shd w:fill="F8FAFB"/>
-            <w:tcMar>
-              <w:top w:w="90" w:type="dxa"/>
-              <w:start w:w="120" w:type="dxa"/>
-              <w:bottom w:w="90" w:type="dxa"/>
-              <w:end w:w="120" w:type="dxa"/>
-            </w:tcMar>
-            <w:vAlign w:val="center"/>
-          </w:tcPr>
-          <w:p>
-            <w:pPr>
-              <w:spacing w:after="0" w:line="240" w:lineRule="auto"/>
-            </w:pPr>
-            <w:r>
-              <w:rPr>
-                <w:rFonts w:ascii="Arial" w:hAnsi="Arial"/>
-                <w:color w:val="202124"/>
-                <w:sz w:val="16"/>
-              </w:rPr>
-              <w:t>Koppeling met programma en gebied.</w:t>
-            </w:r>
-          </w:p>
-        </w:tc>
-      </w:tr>
-      <w:tr>
-        <w:trPr>
-          <w:cantSplit w:val="true"/>
-        </w:trPr>
-        <w:tc>
-          <w:tcPr>
-            <w:tcW w:type="dxa" w:w="1700"/>
-            <w:tcMar>
-              <w:top w:w="90" w:type="dxa"/>
-              <w:start w:w="120" w:type="dxa"/>
-              <w:bottom w:w="90" w:type="dxa"/>
-              <w:end w:w="120" w:type="dxa"/>
-            </w:tcMar>
-            <w:vAlign w:val="center"/>
-          </w:tcPr>
-          <w:p>
-            <w:pPr>
-              <w:spacing w:after="0" w:line="240" w:lineRule="auto"/>
-            </w:pPr>
-            <w:r>
-              <w:rPr>
-                <w:rFonts w:ascii="Arial" w:hAnsi="Arial"/>
-                <w:color w:val="202124"/>
-                <w:sz w:val="16"/>
-              </w:rPr>
-              <w:t>meetlocatieversie</w:t>
-            </w:r>
-          </w:p>
-        </w:tc>
-        <w:tc>
-          <w:tcPr>
-            <w:tcW w:type="dxa" w:w="2550"/>
-            <w:tcMar>
-              <w:top w:w="90" w:type="dxa"/>
-              <w:start w:w="120" w:type="dxa"/>
-              <w:bottom w:w="90" w:type="dxa"/>
-              <w:end w:w="120" w:type="dxa"/>
-            </w:tcMar>
-            <w:vAlign w:val="center"/>
-          </w:tcPr>
-          <w:p>
-            <w:pPr>
-              <w:spacing w:after="0" w:line="240" w:lineRule="auto"/>
-            </w:pPr>
-            <w:r>
-              <w:rPr>
-                <w:rFonts w:ascii="Arial" w:hAnsi="Arial"/>
-                <w:color w:val="202124"/>
-                <w:sz w:val="16"/>
-              </w:rPr>
-              <w:t>locatieversie_id, meetlocatie_id</w:t>
-            </w:r>
-          </w:p>
-        </w:tc>
-        <w:tc>
-          <w:tcPr>
-            <w:tcW w:type="dxa" w:w="1900"/>
-            <w:tcMar>
-              <w:top w:w="90" w:type="dxa"/>
-              <w:start w:w="120" w:type="dxa"/>
-              <w:bottom w:w="90" w:type="dxa"/>
-              <w:end w:w="120" w:type="dxa"/>
-            </w:tcMar>
-            <w:vAlign w:val="center"/>
-          </w:tcPr>
-          <w:p>
-            <w:pPr>
-              <w:spacing w:after="0" w:line="240" w:lineRule="auto"/>
-            </w:pPr>
-            <w:r>
-              <w:rPr>
-                <w:rFonts w:ascii="Arial" w:hAnsi="Arial"/>
-                <w:color w:val="202124"/>
-                <w:sz w:val="16"/>
-              </w:rPr>
-              <w:t>PK + FK</w:t>
-            </w:r>
-          </w:p>
-        </w:tc>
-        <w:tc>
-          <w:tcPr>
-            <w:tcW w:type="dxa" w:w="3210"/>
-            <w:tcMar>
-              <w:top w:w="90" w:type="dxa"/>
-              <w:start w:w="120" w:type="dxa"/>
-              <w:bottom w:w="90" w:type="dxa"/>
-              <w:end w:w="120" w:type="dxa"/>
-            </w:tcMar>
-            <w:vAlign w:val="center"/>
-          </w:tcPr>
-          <w:p>
-            <w:pPr>
-              <w:spacing w:after="0" w:line="240" w:lineRule="auto"/>
-            </w:pPr>
-            <w:r>
-              <w:rPr>
-                <w:rFonts w:ascii="Arial" w:hAnsi="Arial"/>
-                <w:color w:val="202124"/>
-                <w:sz w:val="16"/>
-              </w:rPr>
-              <w:t>Geometrische versie van de meetlocatie.</w:t>
-            </w:r>
-          </w:p>
-        </w:tc>
-      </w:tr>
-      <w:tr>
-        <w:trPr>
-          <w:cantSplit w:val="true"/>
-        </w:trPr>
-        <w:tc>
-          <w:tcPr>
-            <w:tcW w:type="dxa" w:w="1700"/>
-            <w:shd w:fill="F8FAFB"/>
-            <w:tcMar>
-              <w:top w:w="90" w:type="dxa"/>
-              <w:start w:w="120" w:type="dxa"/>
-              <w:bottom w:w="90" w:type="dxa"/>
-              <w:end w:w="120" w:type="dxa"/>
-            </w:tcMar>
-            <w:vAlign w:val="center"/>
-          </w:tcPr>
-          <w:p>
-            <w:pPr>
-              <w:spacing w:after="0" w:line="240" w:lineRule="auto"/>
-            </w:pPr>
-            <w:r>
-              <w:rPr>
-                <w:rFonts w:ascii="Arial" w:hAnsi="Arial"/>
-                <w:color w:val="202124"/>
-                <w:sz w:val="16"/>
-              </w:rPr>
-              <w:t>meetlocatieversie</w:t>
-            </w:r>
-          </w:p>
-        </w:tc>
-        <w:tc>
-          <w:tcPr>
-            <w:tcW w:type="dxa" w:w="2550"/>
-            <w:shd w:fill="F8FAFB"/>
-            <w:tcMar>
-              <w:top w:w="90" w:type="dxa"/>
-              <w:start w:w="120" w:type="dxa"/>
-              <w:bottom w:w="90" w:type="dxa"/>
-              <w:end w:w="120" w:type="dxa"/>
-            </w:tcMar>
-            <w:vAlign w:val="center"/>
-          </w:tcPr>
-          <w:p>
-            <w:pPr>
-              <w:spacing w:after="0" w:line="240" w:lineRule="auto"/>
-            </w:pPr>
-            <w:r>
-              <w:rPr>
-                <w:rFonts w:ascii="Arial" w:hAnsi="Arial"/>
-                <w:color w:val="202124"/>
-                <w:sz w:val="16"/>
-              </w:rPr>
-              <w:t>geldig_van/tot, geometrie, vervangingsreden</w:t>
-            </w:r>
-          </w:p>
-        </w:tc>
-        <w:tc>
-          <w:tcPr>
-            <w:tcW w:type="dxa" w:w="1900"/>
-            <w:shd w:fill="F8FAFB"/>
-            <w:tcMar>
-              <w:top w:w="90" w:type="dxa"/>
-              <w:start w:w="120" w:type="dxa"/>
-              <w:bottom w:w="90" w:type="dxa"/>
-              <w:end w:w="120" w:type="dxa"/>
-            </w:tcMar>
-            <w:vAlign w:val="center"/>
-          </w:tcPr>
-          <w:p>
-            <w:pPr>
-              <w:spacing w:after="0" w:line="240" w:lineRule="auto"/>
-            </w:pPr>
-            <w:r>
-              <w:rPr>
-                <w:rFonts w:ascii="Arial" w:hAnsi="Arial"/>
-                <w:color w:val="202124"/>
-                <w:sz w:val="16"/>
-              </w:rPr>
-              <w:t>verplicht</w:t>
-            </w:r>
-          </w:p>
-        </w:tc>
-        <w:tc>
-          <w:tcPr>
-            <w:tcW w:type="dxa" w:w="3210"/>
-            <w:shd w:fill="F8FAFB"/>
-            <w:tcMar>
-              <w:top w:w="90" w:type="dxa"/>
-              <w:start w:w="120" w:type="dxa"/>
-              <w:bottom w:w="90" w:type="dxa"/>
-              <w:end w:w="120" w:type="dxa"/>
-            </w:tcMar>
-            <w:vAlign w:val="center"/>
-          </w:tcPr>
-          <w:p>
-            <w:pPr>
-              <w:spacing w:after="0" w:line="240" w:lineRule="auto"/>
-            </w:pPr>
-            <w:r>
-              <w:rPr>
-                <w:rFonts w:ascii="Arial" w:hAnsi="Arial"/>
-                <w:color w:val="202124"/>
-                <w:sz w:val="16"/>
-              </w:rPr>
-              <w:t>Verplaatsing door raster of beheer blijft zichtbaar.</w:t>
-            </w:r>
-          </w:p>
-        </w:tc>
-      </w:tr>
-      <w:tr>
-        <w:trPr>
-          <w:cantSplit w:val="true"/>
-        </w:trPr>
-        <w:tc>
-          <w:tcPr>
-            <w:tcW w:type="dxa" w:w="1700"/>
-            <w:tcMar>
-              <w:top w:w="90" w:type="dxa"/>
-              <w:start w:w="120" w:type="dxa"/>
-              <w:bottom w:w="90" w:type="dxa"/>
-              <w:end w:w="120" w:type="dxa"/>
-            </w:tcMar>
-            <w:vAlign w:val="center"/>
-          </w:tcPr>
-          <w:p>
-            <w:pPr>
-              <w:spacing w:after="0" w:line="240" w:lineRule="auto"/>
-            </w:pPr>
-            <w:r>
-              <w:rPr>
-                <w:rFonts w:ascii="Arial" w:hAnsi="Arial"/>
-                <w:color w:val="202124"/>
-                <w:sz w:val="16"/>
-              </w:rPr>
-              <w:t>meetbezoek</w:t>
-            </w:r>
-          </w:p>
-        </w:tc>
-        <w:tc>
-          <w:tcPr>
-            <w:tcW w:type="dxa" w:w="2550"/>
-            <w:tcMar>
-              <w:top w:w="90" w:type="dxa"/>
-              <w:start w:w="120" w:type="dxa"/>
-              <w:bottom w:w="90" w:type="dxa"/>
-              <w:end w:w="120" w:type="dxa"/>
-            </w:tcMar>
-            <w:vAlign w:val="center"/>
-          </w:tcPr>
-          <w:p>
-            <w:pPr>
-              <w:spacing w:after="0" w:line="240" w:lineRule="auto"/>
-            </w:pPr>
-            <w:r>
-              <w:rPr>
-                <w:rFonts w:ascii="Arial" w:hAnsi="Arial"/>
-                <w:color w:val="202124"/>
-                <w:sz w:val="16"/>
-              </w:rPr>
-              <w:t>meetbezoek_id, locatieversie_id</w:t>
-            </w:r>
-          </w:p>
-        </w:tc>
-        <w:tc>
-          <w:tcPr>
-            <w:tcW w:type="dxa" w:w="1900"/>
-            <w:tcMar>
-              <w:top w:w="90" w:type="dxa"/>
-              <w:start w:w="120" w:type="dxa"/>
-              <w:bottom w:w="90" w:type="dxa"/>
-              <w:end w:w="120" w:type="dxa"/>
-            </w:tcMar>
-            <w:vAlign w:val="center"/>
-          </w:tcPr>
-          <w:p>
-            <w:pPr>
-              <w:spacing w:after="0" w:line="240" w:lineRule="auto"/>
-            </w:pPr>
-            <w:r>
-              <w:rPr>
-                <w:rFonts w:ascii="Arial" w:hAnsi="Arial"/>
-                <w:color w:val="202124"/>
-                <w:sz w:val="16"/>
-              </w:rPr>
-              <w:t>PK + FK</w:t>
-            </w:r>
-          </w:p>
-        </w:tc>
-        <w:tc>
-          <w:tcPr>
-            <w:tcW w:type="dxa" w:w="3210"/>
-            <w:tcMar>
-              <w:top w:w="90" w:type="dxa"/>
-              <w:start w:w="120" w:type="dxa"/>
-              <w:bottom w:w="90" w:type="dxa"/>
-              <w:end w:w="120" w:type="dxa"/>
-            </w:tcMar>
-            <w:vAlign w:val="center"/>
-          </w:tcPr>
-          <w:p>
-            <w:pPr>
-              <w:spacing w:after="0" w:line="240" w:lineRule="auto"/>
-            </w:pPr>
-            <w:r>
-              <w:rPr>
-                <w:rFonts w:ascii="Arial" w:hAnsi="Arial"/>
-                <w:color w:val="202124"/>
-                <w:sz w:val="16"/>
-              </w:rPr>
-              <w:t>Eén feitelijk veldbezoek.</w:t>
-            </w:r>
-          </w:p>
-        </w:tc>
-      </w:tr>
-      <w:tr>
-        <w:trPr>
-          <w:cantSplit w:val="true"/>
-        </w:trPr>
-        <w:tc>
-          <w:tcPr>
-            <w:tcW w:type="dxa" w:w="1700"/>
-            <w:shd w:fill="F8FAFB"/>
-            <w:tcMar>
-              <w:top w:w="90" w:type="dxa"/>
-              <w:start w:w="120" w:type="dxa"/>
-              <w:bottom w:w="90" w:type="dxa"/>
-              <w:end w:w="120" w:type="dxa"/>
-            </w:tcMar>
-            <w:vAlign w:val="center"/>
-          </w:tcPr>
-          <w:p>
-            <w:pPr>
-              <w:spacing w:after="0" w:line="240" w:lineRule="auto"/>
-            </w:pPr>
-            <w:r>
-              <w:rPr>
-                <w:rFonts w:ascii="Arial" w:hAnsi="Arial"/>
-                <w:color w:val="202124"/>
-                <w:sz w:val="16"/>
-              </w:rPr>
-              <w:t>meetbezoek</w:t>
-            </w:r>
-          </w:p>
-        </w:tc>
-        <w:tc>
-          <w:tcPr>
-            <w:tcW w:type="dxa" w:w="2550"/>
-            <w:shd w:fill="F8FAFB"/>
-            <w:tcMar>
-              <w:top w:w="90" w:type="dxa"/>
-              <w:start w:w="120" w:type="dxa"/>
-              <w:bottom w:w="90" w:type="dxa"/>
-              <w:end w:w="120" w:type="dxa"/>
-            </w:tcMar>
-            <w:vAlign w:val="center"/>
-          </w:tcPr>
-          <w:p>
-            <w:pPr>
-              <w:spacing w:after="0" w:line="240" w:lineRule="auto"/>
-            </w:pPr>
-            <w:r>
-              <w:rPr>
-                <w:rFonts w:ascii="Arial" w:hAnsi="Arial"/>
-                <w:color w:val="202124"/>
-                <w:sz w:val="16"/>
-              </w:rPr>
-              <w:t>meet_tijd, protocolversie, waarnemer</w:t>
-            </w:r>
-          </w:p>
-        </w:tc>
-        <w:tc>
-          <w:tcPr>
-            <w:tcW w:type="dxa" w:w="1900"/>
-            <w:shd w:fill="F8FAFB"/>
-            <w:tcMar>
-              <w:top w:w="90" w:type="dxa"/>
-              <w:start w:w="120" w:type="dxa"/>
-              <w:bottom w:w="90" w:type="dxa"/>
-              <w:end w:w="120" w:type="dxa"/>
-            </w:tcMar>
-            <w:vAlign w:val="center"/>
-          </w:tcPr>
-          <w:p>
-            <w:pPr>
-              <w:spacing w:after="0" w:line="240" w:lineRule="auto"/>
-            </w:pPr>
-            <w:r>
-              <w:rPr>
-                <w:rFonts w:ascii="Arial" w:hAnsi="Arial"/>
-                <w:color w:val="202124"/>
-                <w:sz w:val="16"/>
-              </w:rPr>
-              <w:t>verplicht</w:t>
-            </w:r>
-          </w:p>
-        </w:tc>
-        <w:tc>
-          <w:tcPr>
-            <w:tcW w:type="dxa" w:w="3210"/>
-            <w:shd w:fill="F8FAFB"/>
-            <w:tcMar>
-              <w:top w:w="90" w:type="dxa"/>
-              <w:start w:w="120" w:type="dxa"/>
-              <w:bottom w:w="90" w:type="dxa"/>
-              <w:end w:w="120" w:type="dxa"/>
-            </w:tcMar>
-            <w:vAlign w:val="center"/>
-          </w:tcPr>
-          <w:p>
-            <w:pPr>
-              <w:spacing w:after="0" w:line="240" w:lineRule="auto"/>
-            </w:pPr>
-            <w:r>
-              <w:rPr>
-                <w:rFonts w:ascii="Arial" w:hAnsi="Arial"/>
-                <w:color w:val="202124"/>
-                <w:sz w:val="16"/>
-              </w:rPr>
-              <w:t>Wanneer, volgens welke methode en door wie.</w:t>
-            </w:r>
-          </w:p>
-        </w:tc>
-      </w:tr>
-      <w:tr>
-        <w:trPr>
-          <w:cantSplit w:val="true"/>
-        </w:trPr>
-        <w:tc>
-          <w:tcPr>
-            <w:tcW w:type="dxa" w:w="1700"/>
-            <w:tcMar>
-              <w:top w:w="90" w:type="dxa"/>
-              <w:start w:w="120" w:type="dxa"/>
-              <w:bottom w:w="90" w:type="dxa"/>
-              <w:end w:w="120" w:type="dxa"/>
-            </w:tcMar>
-            <w:vAlign w:val="center"/>
-          </w:tcPr>
-          <w:p>
-            <w:pPr>
-              <w:spacing w:after="0" w:line="240" w:lineRule="auto"/>
-            </w:pPr>
-            <w:r>
-              <w:rPr>
-                <w:rFonts w:ascii="Arial" w:hAnsi="Arial"/>
-                <w:color w:val="202124"/>
-                <w:sz w:val="16"/>
-              </w:rPr>
-              <w:t>meetbezoek</w:t>
-            </w:r>
-          </w:p>
-        </w:tc>
-        <w:tc>
-          <w:tcPr>
-            <w:tcW w:type="dxa" w:w="2550"/>
-            <w:tcMar>
-              <w:top w:w="90" w:type="dxa"/>
-              <w:start w:w="120" w:type="dxa"/>
-              <w:bottom w:w="90" w:type="dxa"/>
-              <w:end w:w="120" w:type="dxa"/>
-            </w:tcMar>
-            <w:vAlign w:val="center"/>
-          </w:tcPr>
-          <w:p>
-            <w:pPr>
-              <w:spacing w:after="0" w:line="240" w:lineRule="auto"/>
-            </w:pPr>
-            <w:r>
-              <w:rPr>
-                <w:rFonts w:ascii="Arial" w:hAnsi="Arial"/>
-                <w:color w:val="202124"/>
-                <w:sz w:val="16"/>
-              </w:rPr>
-              <w:t>inspanning, omstandigheden, kwaliteitsstatus</w:t>
-            </w:r>
-          </w:p>
-        </w:tc>
-        <w:tc>
-          <w:tcPr>
-            <w:tcW w:type="dxa" w:w="1900"/>
-            <w:tcMar>
-              <w:top w:w="90" w:type="dxa"/>
-              <w:start w:w="120" w:type="dxa"/>
-              <w:bottom w:w="90" w:type="dxa"/>
-              <w:end w:w="120" w:type="dxa"/>
-            </w:tcMar>
-            <w:vAlign w:val="center"/>
-          </w:tcPr>
-          <w:p>
-            <w:pPr>
-              <w:spacing w:after="0" w:line="240" w:lineRule="auto"/>
-            </w:pPr>
-            <w:r>
-              <w:rPr>
-                <w:rFonts w:ascii="Arial" w:hAnsi="Arial"/>
-                <w:color w:val="202124"/>
-                <w:sz w:val="16"/>
-              </w:rPr>
-              <w:t>verplicht</w:t>
-            </w:r>
-          </w:p>
-        </w:tc>
-        <w:tc>
-          <w:tcPr>
-            <w:tcW w:type="dxa" w:w="3210"/>
-            <w:tcMar>
-              <w:top w:w="90" w:type="dxa"/>
-              <w:start w:w="120" w:type="dxa"/>
-              <w:bottom w:w="90" w:type="dxa"/>
-              <w:end w:w="120" w:type="dxa"/>
-            </w:tcMar>
-            <w:vAlign w:val="center"/>
-          </w:tcPr>
-          <w:p>
-            <w:pPr>
-              <w:spacing w:after="0" w:line="240" w:lineRule="auto"/>
-            </w:pPr>
-            <w:r>
-              <w:rPr>
-                <w:rFonts w:ascii="Arial" w:hAnsi="Arial"/>
-                <w:color w:val="202124"/>
-                <w:sz w:val="16"/>
-              </w:rPr>
-              <w:t>Duur, rondes, weer en validatie.</w:t>
-            </w:r>
-          </w:p>
-        </w:tc>
-      </w:tr>
-      <w:tr>
-        <w:trPr>
-          <w:cantSplit w:val="true"/>
-        </w:trPr>
-        <w:tc>
-          <w:tcPr>
-            <w:tcW w:type="dxa" w:w="1700"/>
-            <w:shd w:fill="F8FAFB"/>
-            <w:tcMar>
-              <w:top w:w="90" w:type="dxa"/>
-              <w:start w:w="120" w:type="dxa"/>
-              <w:bottom w:w="90" w:type="dxa"/>
-              <w:end w:w="120" w:type="dxa"/>
-            </w:tcMar>
-            <w:vAlign w:val="center"/>
-          </w:tcPr>
-          <w:p>
-            <w:pPr>
-              <w:spacing w:after="0" w:line="240" w:lineRule="auto"/>
-            </w:pPr>
-            <w:r>
-              <w:rPr>
-                <w:rFonts w:ascii="Arial" w:hAnsi="Arial"/>
-                <w:color w:val="202124"/>
-                <w:sz w:val="16"/>
-              </w:rPr>
-              <w:t>ecologische_reeks_koppeling</w:t>
-            </w:r>
-          </w:p>
-        </w:tc>
-        <w:tc>
-          <w:tcPr>
-            <w:tcW w:type="dxa" w:w="2550"/>
-            <w:shd w:fill="F8FAFB"/>
-            <w:tcMar>
-              <w:top w:w="90" w:type="dxa"/>
-              <w:start w:w="120" w:type="dxa"/>
-              <w:bottom w:w="90" w:type="dxa"/>
-              <w:end w:w="120" w:type="dxa"/>
-            </w:tcMar>
-            <w:vAlign w:val="center"/>
-          </w:tcPr>
-          <w:p>
-            <w:pPr>
-              <w:spacing w:after="0" w:line="240" w:lineRule="auto"/>
-            </w:pPr>
-            <w:r>
-              <w:rPr>
-                <w:rFonts w:ascii="Arial" w:hAnsi="Arial"/>
-                <w:color w:val="202124"/>
-                <w:sz w:val="16"/>
-              </w:rPr>
-              <w:t>meetbezoek_id, bronsysteem, externe_sleutel</w:t>
-            </w:r>
-          </w:p>
-        </w:tc>
-        <w:tc>
-          <w:tcPr>
-            <w:tcW w:type="dxa" w:w="1900"/>
-            <w:shd w:fill="F8FAFB"/>
-            <w:tcMar>
-              <w:top w:w="90" w:type="dxa"/>
-              <w:start w:w="120" w:type="dxa"/>
-              <w:bottom w:w="90" w:type="dxa"/>
-              <w:end w:w="120" w:type="dxa"/>
-            </w:tcMar>
-            <w:vAlign w:val="center"/>
-          </w:tcPr>
-          <w:p>
-            <w:pPr>
-              <w:spacing w:after="0" w:line="240" w:lineRule="auto"/>
-            </w:pPr>
-            <w:r>
-              <w:rPr>
-                <w:rFonts w:ascii="Arial" w:hAnsi="Arial"/>
-                <w:color w:val="202124"/>
-                <w:sz w:val="16"/>
-              </w:rPr>
-              <w:t>FK + UK</w:t>
-            </w:r>
-          </w:p>
-        </w:tc>
-        <w:tc>
-          <w:tcPr>
-            <w:tcW w:type="dxa" w:w="3210"/>
-            <w:shd w:fill="F8FAFB"/>
-            <w:tcMar>
-              <w:top w:w="90" w:type="dxa"/>
-              <w:start w:w="120" w:type="dxa"/>
-              <w:bottom w:w="90" w:type="dxa"/>
-              <w:end w:w="120" w:type="dxa"/>
-            </w:tcMar>
-            <w:vAlign w:val="center"/>
-          </w:tcPr>
-          <w:p>
-            <w:pPr>
-              <w:spacing w:after="0" w:line="240" w:lineRule="auto"/>
-            </w:pPr>
-            <w:r>
-              <w:rPr>
-                <w:rFonts w:ascii="Arial" w:hAnsi="Arial"/>
-                <w:color w:val="202124"/>
-                <w:sz w:val="16"/>
-              </w:rPr>
-              <w:t>Koppelt naar bestaande vogel-, vegetatie- of faunadata.</w:t>
-            </w:r>
-          </w:p>
-        </w:tc>
-      </w:tr>
-    </w:tbl>
-    <w:p>
-      <w:pPr>
-        <w:spacing w:after="40"/>
-      </w:pPr>
-    </w:p>
-    <w:p>
-      <w:pPr>
-        <w:pStyle w:val="Heading2"/>
-        <w:keepNext/>
-      </w:pPr>
-      <w:r>
-        <w:t>6.5 Standplaats en andere grazers</w:t>
-      </w:r>
-    </w:p>
-    <w:tbl>
-      <w:tblPr>
-        <w:tblStyle w:val="TableGrid"/>
-        <w:tblW w:type="dxa" w:w="9360"/>
-        <w:jc w:val="left"/>
-        <w:tblLayout w:type="fixed"/>
-        <w:tblLook w:firstColumn="1" w:firstRow="1" w:lastColumn="0" w:lastRow="0" w:noHBand="0" w:noVBand="1" w:val="04A0"/>
-        <w:tblInd w:w="120" w:type="dxa"/>
-      </w:tblPr>
-      <w:tblGrid>
-        <w:gridCol w:w="1700"/>
-        <w:gridCol w:w="2550"/>
-        <w:gridCol w:w="1900"/>
-        <w:gridCol w:w="3210"/>
-      </w:tblGrid>
-      <w:tr>
-        <w:trPr>
-          <w:tblHeader w:val="true"/>
-          <w:cantSplit w:val="true"/>
-        </w:trPr>
-        <w:tc>
-          <w:tcPr>
-            <w:tcW w:type="dxa" w:w="1700"/>
-            <w:shd w:fill="245A78"/>
-            <w:tcMar>
-              <w:top w:w="90" w:type="dxa"/>
-              <w:start w:w="120" w:type="dxa"/>
-              <w:bottom w:w="90" w:type="dxa"/>
-              <w:end w:w="120" w:type="dxa"/>
-            </w:tcMar>
-            <w:vAlign w:val="center"/>
-          </w:tcPr>
-          <w:p>
-            <w:pPr>
-              <w:spacing w:after="0"/>
-            </w:pPr>
-            <w:r>
-              <w:rPr>
-                <w:rFonts w:ascii="Arial" w:hAnsi="Arial"/>
-                <w:b/>
-                <w:color w:val="FFFFFF"/>
-                <w:sz w:val="16"/>
-              </w:rPr>
-              <w:t>Tabel</w:t>
-            </w:r>
-          </w:p>
-        </w:tc>
-        <w:tc>
-          <w:tcPr>
-            <w:tcW w:type="dxa" w:w="2550"/>
-            <w:shd w:fill="245A78"/>
-            <w:tcMar>
-              <w:top w:w="90" w:type="dxa"/>
-              <w:start w:w="120" w:type="dxa"/>
-              <w:bottom w:w="90" w:type="dxa"/>
-              <w:end w:w="120" w:type="dxa"/>
-            </w:tcMar>
-            <w:vAlign w:val="center"/>
-          </w:tcPr>
-          <w:p>
-            <w:pPr>
-              <w:spacing w:after="0"/>
-            </w:pPr>
-            <w:r>
-              <w:rPr>
-                <w:rFonts w:ascii="Arial" w:hAnsi="Arial"/>
-                <w:b/>
-                <w:color w:val="FFFFFF"/>
-                <w:sz w:val="16"/>
-              </w:rPr>
-              <w:t>Kolom(men)</w:t>
-            </w:r>
-          </w:p>
-        </w:tc>
-        <w:tc>
-          <w:tcPr>
-            <w:tcW w:type="dxa" w:w="1900"/>
-            <w:shd w:fill="245A78"/>
-            <w:tcMar>
-              <w:top w:w="90" w:type="dxa"/>
-              <w:start w:w="120" w:type="dxa"/>
-              <w:bottom w:w="90" w:type="dxa"/>
-              <w:end w:w="120" w:type="dxa"/>
-            </w:tcMar>
-            <w:vAlign w:val="center"/>
-          </w:tcPr>
-          <w:p>
-            <w:pPr>
-              <w:spacing w:after="0"/>
-            </w:pPr>
-            <w:r>
-              <w:rPr>
-                <w:rFonts w:ascii="Arial" w:hAnsi="Arial"/>
-                <w:b/>
-                <w:color w:val="FFFFFF"/>
-                <w:sz w:val="16"/>
-              </w:rPr>
-              <w:t>Sleutel/regel</w:t>
-            </w:r>
-          </w:p>
-        </w:tc>
-        <w:tc>
-          <w:tcPr>
-            <w:tcW w:type="dxa" w:w="3210"/>
-            <w:shd w:fill="245A78"/>
-            <w:tcMar>
-              <w:top w:w="90" w:type="dxa"/>
-              <w:start w:w="120" w:type="dxa"/>
-              <w:bottom w:w="90" w:type="dxa"/>
-              <w:end w:w="120" w:type="dxa"/>
-            </w:tcMar>
-            <w:vAlign w:val="center"/>
-          </w:tcPr>
-          <w:p>
-            <w:pPr>
-              <w:spacing w:after="0"/>
-            </w:pPr>
-            <w:r>
-              <w:rPr>
-                <w:rFonts w:ascii="Arial" w:hAnsi="Arial"/>
-                <w:b/>
-                <w:color w:val="FFFFFF"/>
-                <w:sz w:val="16"/>
-              </w:rPr>
-              <w:t>Betekenis</w:t>
-            </w:r>
-          </w:p>
-        </w:tc>
-      </w:tr>
-      <w:tr>
-        <w:trPr>
-          <w:cantSplit w:val="true"/>
-        </w:trPr>
-        <w:tc>
-          <w:tcPr>
-            <w:tcW w:type="dxa" w:w="1700"/>
-            <w:tcMar>
-              <w:top w:w="90" w:type="dxa"/>
-              <w:start w:w="120" w:type="dxa"/>
-              <w:bottom w:w="90" w:type="dxa"/>
-              <w:end w:w="120" w:type="dxa"/>
-            </w:tcMar>
-            <w:vAlign w:val="center"/>
-          </w:tcPr>
-          <w:p>
-            <w:pPr>
-              <w:spacing w:after="0" w:line="240" w:lineRule="auto"/>
-            </w:pPr>
-            <w:r>
-              <w:rPr>
-                <w:rFonts w:ascii="Arial" w:hAnsi="Arial"/>
-                <w:color w:val="202124"/>
-                <w:sz w:val="16"/>
-              </w:rPr>
-              <w:t>standplaatskenmerk</w:t>
-            </w:r>
-          </w:p>
-        </w:tc>
-        <w:tc>
-          <w:tcPr>
-            <w:tcW w:type="dxa" w:w="2550"/>
-            <w:tcMar>
-              <w:top w:w="90" w:type="dxa"/>
-              <w:start w:w="120" w:type="dxa"/>
-              <w:bottom w:w="90" w:type="dxa"/>
-              <w:end w:w="120" w:type="dxa"/>
-            </w:tcMar>
-            <w:vAlign w:val="center"/>
-          </w:tcPr>
-          <w:p>
-            <w:pPr>
-              <w:spacing w:after="0" w:line="240" w:lineRule="auto"/>
-            </w:pPr>
-            <w:r>
-              <w:rPr>
-                <w:rFonts w:ascii="Arial" w:hAnsi="Arial"/>
-                <w:color w:val="202124"/>
-                <w:sz w:val="16"/>
-              </w:rPr>
-              <w:t>kenmerkmeting_id, locatieversie_id</w:t>
-            </w:r>
-          </w:p>
-        </w:tc>
-        <w:tc>
-          <w:tcPr>
-            <w:tcW w:type="dxa" w:w="1900"/>
-            <w:tcMar>
-              <w:top w:w="90" w:type="dxa"/>
-              <w:start w:w="120" w:type="dxa"/>
-              <w:bottom w:w="90" w:type="dxa"/>
-              <w:end w:w="120" w:type="dxa"/>
-            </w:tcMar>
-            <w:vAlign w:val="center"/>
-          </w:tcPr>
-          <w:p>
-            <w:pPr>
-              <w:spacing w:after="0" w:line="240" w:lineRule="auto"/>
-            </w:pPr>
-            <w:r>
-              <w:rPr>
-                <w:rFonts w:ascii="Arial" w:hAnsi="Arial"/>
-                <w:color w:val="202124"/>
-                <w:sz w:val="16"/>
-              </w:rPr>
-              <w:t>PK + FK</w:t>
-            </w:r>
-          </w:p>
-        </w:tc>
-        <w:tc>
-          <w:tcPr>
-            <w:tcW w:type="dxa" w:w="3210"/>
-            <w:tcMar>
-              <w:top w:w="90" w:type="dxa"/>
-              <w:start w:w="120" w:type="dxa"/>
-              <w:bottom w:w="90" w:type="dxa"/>
-              <w:end w:w="120" w:type="dxa"/>
-            </w:tcMar>
-            <w:vAlign w:val="center"/>
-          </w:tcPr>
-          <w:p>
-            <w:pPr>
-              <w:spacing w:after="0" w:line="240" w:lineRule="auto"/>
-            </w:pPr>
-            <w:r>
-              <w:rPr>
-                <w:rFonts w:ascii="Arial" w:hAnsi="Arial"/>
-                <w:color w:val="202124"/>
-                <w:sz w:val="16"/>
-              </w:rPr>
-              <w:t>Context op dezelfde ruimtelijke schaal als de meting.</w:t>
-            </w:r>
-          </w:p>
-        </w:tc>
-      </w:tr>
-      <w:tr>
-        <w:trPr>
-          <w:cantSplit w:val="true"/>
-        </w:trPr>
-        <w:tc>
-          <w:tcPr>
-            <w:tcW w:type="dxa" w:w="1700"/>
-            <w:shd w:fill="F8FAFB"/>
-            <w:tcMar>
-              <w:top w:w="90" w:type="dxa"/>
-              <w:start w:w="120" w:type="dxa"/>
-              <w:bottom w:w="90" w:type="dxa"/>
-              <w:end w:w="120" w:type="dxa"/>
-            </w:tcMar>
-            <w:vAlign w:val="center"/>
-          </w:tcPr>
-          <w:p>
-            <w:pPr>
-              <w:spacing w:after="0" w:line="240" w:lineRule="auto"/>
-            </w:pPr>
-            <w:r>
-              <w:rPr>
-                <w:rFonts w:ascii="Arial" w:hAnsi="Arial"/>
-                <w:color w:val="202124"/>
-                <w:sz w:val="16"/>
-              </w:rPr>
-              <w:t>standplaatskenmerk</w:t>
-            </w:r>
-          </w:p>
-        </w:tc>
-        <w:tc>
-          <w:tcPr>
-            <w:tcW w:type="dxa" w:w="2550"/>
-            <w:shd w:fill="F8FAFB"/>
-            <w:tcMar>
-              <w:top w:w="90" w:type="dxa"/>
-              <w:start w:w="120" w:type="dxa"/>
-              <w:bottom w:w="90" w:type="dxa"/>
-              <w:end w:w="120" w:type="dxa"/>
-            </w:tcMar>
-            <w:vAlign w:val="center"/>
-          </w:tcPr>
-          <w:p>
-            <w:pPr>
-              <w:spacing w:after="0" w:line="240" w:lineRule="auto"/>
-            </w:pPr>
-            <w:r>
-              <w:rPr>
-                <w:rFonts w:ascii="Arial" w:hAnsi="Arial"/>
-                <w:color w:val="202124"/>
-                <w:sz w:val="16"/>
-              </w:rPr>
-              <w:t>habitatcode, vegetatietype, reliëf, expositie</w:t>
-            </w:r>
-          </w:p>
-        </w:tc>
-        <w:tc>
-          <w:tcPr>
-            <w:tcW w:type="dxa" w:w="1900"/>
-            <w:shd w:fill="F8FAFB"/>
-            <w:tcMar>
-              <w:top w:w="90" w:type="dxa"/>
-              <w:start w:w="120" w:type="dxa"/>
-              <w:bottom w:w="90" w:type="dxa"/>
-              <w:end w:w="120" w:type="dxa"/>
-            </w:tcMar>
-            <w:vAlign w:val="center"/>
-          </w:tcPr>
-          <w:p>
-            <w:pPr>
-              <w:spacing w:after="0" w:line="240" w:lineRule="auto"/>
-            </w:pPr>
-            <w:r>
-              <w:rPr>
-                <w:rFonts w:ascii="Arial" w:hAnsi="Arial"/>
-                <w:color w:val="202124"/>
-                <w:sz w:val="16"/>
-              </w:rPr>
-              <w:t>optioneel per protocol</w:t>
-            </w:r>
-          </w:p>
-        </w:tc>
-        <w:tc>
-          <w:tcPr>
-            <w:tcW w:type="dxa" w:w="3210"/>
-            <w:shd w:fill="F8FAFB"/>
-            <w:tcMar>
-              <w:top w:w="90" w:type="dxa"/>
-              <w:start w:w="120" w:type="dxa"/>
-              <w:bottom w:w="90" w:type="dxa"/>
-              <w:end w:w="120" w:type="dxa"/>
-            </w:tcMar>
-            <w:vAlign w:val="center"/>
-          </w:tcPr>
-          <w:p>
-            <w:pPr>
-              <w:spacing w:after="0" w:line="240" w:lineRule="auto"/>
-            </w:pPr>
-            <w:r>
-              <w:rPr>
-                <w:rFonts w:ascii="Arial" w:hAnsi="Arial"/>
-                <w:color w:val="202124"/>
-                <w:sz w:val="16"/>
-              </w:rPr>
-              <w:t>Uitgangssituatie en ruimtelijke stratificatie.</w:t>
-            </w:r>
-          </w:p>
-        </w:tc>
-      </w:tr>
-      <w:tr>
-        <w:trPr>
-          <w:cantSplit w:val="true"/>
-        </w:trPr>
-        <w:tc>
-          <w:tcPr>
-            <w:tcW w:type="dxa" w:w="1700"/>
-            <w:tcMar>
-              <w:top w:w="90" w:type="dxa"/>
-              <w:start w:w="120" w:type="dxa"/>
-              <w:bottom w:w="90" w:type="dxa"/>
-              <w:end w:w="120" w:type="dxa"/>
-            </w:tcMar>
-            <w:vAlign w:val="center"/>
-          </w:tcPr>
-          <w:p>
-            <w:pPr>
-              <w:spacing w:after="0" w:line="240" w:lineRule="auto"/>
-            </w:pPr>
-            <w:r>
-              <w:rPr>
-                <w:rFonts w:ascii="Arial" w:hAnsi="Arial"/>
-                <w:color w:val="202124"/>
-                <w:sz w:val="16"/>
-              </w:rPr>
-              <w:t>standplaatskenmerk</w:t>
-            </w:r>
-          </w:p>
-        </w:tc>
-        <w:tc>
-          <w:tcPr>
-            <w:tcW w:type="dxa" w:w="2550"/>
-            <w:tcMar>
-              <w:top w:w="90" w:type="dxa"/>
-              <w:start w:w="120" w:type="dxa"/>
-              <w:bottom w:w="90" w:type="dxa"/>
-              <w:end w:w="120" w:type="dxa"/>
-            </w:tcMar>
-            <w:vAlign w:val="center"/>
-          </w:tcPr>
-          <w:p>
-            <w:pPr>
-              <w:spacing w:after="0" w:line="240" w:lineRule="auto"/>
-            </w:pPr>
-            <w:r>
-              <w:rPr>
-                <w:rFonts w:ascii="Arial" w:hAnsi="Arial"/>
-                <w:color w:val="202124"/>
-                <w:sz w:val="16"/>
-              </w:rPr>
-              <w:t>pH, kalk, vocht, organische_stof</w:t>
-            </w:r>
-          </w:p>
-        </w:tc>
-        <w:tc>
-          <w:tcPr>
-            <w:tcW w:type="dxa" w:w="1900"/>
-            <w:tcMar>
-              <w:top w:w="90" w:type="dxa"/>
-              <w:start w:w="120" w:type="dxa"/>
-              <w:bottom w:w="90" w:type="dxa"/>
-              <w:end w:w="120" w:type="dxa"/>
-            </w:tcMar>
-            <w:vAlign w:val="center"/>
-          </w:tcPr>
-          <w:p>
-            <w:pPr>
-              <w:spacing w:after="0" w:line="240" w:lineRule="auto"/>
-            </w:pPr>
-            <w:r>
-              <w:rPr>
-                <w:rFonts w:ascii="Arial" w:hAnsi="Arial"/>
-                <w:color w:val="202124"/>
-                <w:sz w:val="16"/>
-              </w:rPr>
-              <w:t>waarde + eenheid</w:t>
-            </w:r>
-          </w:p>
-        </w:tc>
-        <w:tc>
-          <w:tcPr>
-            <w:tcW w:type="dxa" w:w="3210"/>
-            <w:tcMar>
-              <w:top w:w="90" w:type="dxa"/>
-              <w:start w:w="120" w:type="dxa"/>
-              <w:bottom w:w="90" w:type="dxa"/>
-              <w:end w:w="120" w:type="dxa"/>
-            </w:tcMar>
-            <w:vAlign w:val="center"/>
-          </w:tcPr>
-          <w:p>
-            <w:pPr>
-              <w:spacing w:after="0" w:line="240" w:lineRule="auto"/>
-            </w:pPr>
-            <w:r>
-              <w:rPr>
-                <w:rFonts w:ascii="Arial" w:hAnsi="Arial"/>
-                <w:color w:val="202124"/>
-                <w:sz w:val="16"/>
-              </w:rPr>
-              <w:t>Methode, diepte en datum verplicht meeleveren.</w:t>
-            </w:r>
-          </w:p>
-        </w:tc>
-      </w:tr>
-      <w:tr>
-        <w:trPr>
-          <w:cantSplit w:val="true"/>
-        </w:trPr>
-        <w:tc>
-          <w:tcPr>
-            <w:tcW w:type="dxa" w:w="1700"/>
-            <w:shd w:fill="F8FAFB"/>
-            <w:tcMar>
-              <w:top w:w="90" w:type="dxa"/>
-              <w:start w:w="120" w:type="dxa"/>
-              <w:bottom w:w="90" w:type="dxa"/>
-              <w:end w:w="120" w:type="dxa"/>
-            </w:tcMar>
-            <w:vAlign w:val="center"/>
-          </w:tcPr>
-          <w:p>
-            <w:pPr>
-              <w:spacing w:after="0" w:line="240" w:lineRule="auto"/>
-            </w:pPr>
-            <w:r>
-              <w:rPr>
-                <w:rFonts w:ascii="Arial" w:hAnsi="Arial"/>
-                <w:color w:val="202124"/>
-                <w:sz w:val="16"/>
-              </w:rPr>
-              <w:t>wildgrazer_meting</w:t>
-            </w:r>
-          </w:p>
-        </w:tc>
-        <w:tc>
-          <w:tcPr>
-            <w:tcW w:type="dxa" w:w="2550"/>
-            <w:shd w:fill="F8FAFB"/>
-            <w:tcMar>
-              <w:top w:w="90" w:type="dxa"/>
-              <w:start w:w="120" w:type="dxa"/>
-              <w:bottom w:w="90" w:type="dxa"/>
-              <w:end w:w="120" w:type="dxa"/>
-            </w:tcMar>
-            <w:vAlign w:val="center"/>
-          </w:tcPr>
-          <w:p>
-            <w:pPr>
-              <w:spacing w:after="0" w:line="240" w:lineRule="auto"/>
-            </w:pPr>
-            <w:r>
-              <w:rPr>
-                <w:rFonts w:ascii="Arial" w:hAnsi="Arial"/>
-                <w:color w:val="202124"/>
-                <w:sz w:val="16"/>
-              </w:rPr>
-              <w:t>wildgrazer_meting_id, locatieversie_id</w:t>
-            </w:r>
-          </w:p>
-        </w:tc>
-        <w:tc>
-          <w:tcPr>
-            <w:tcW w:type="dxa" w:w="1900"/>
-            <w:shd w:fill="F8FAFB"/>
-            <w:tcMar>
-              <w:top w:w="90" w:type="dxa"/>
-              <w:start w:w="120" w:type="dxa"/>
-              <w:bottom w:w="90" w:type="dxa"/>
-              <w:end w:w="120" w:type="dxa"/>
-            </w:tcMar>
-            <w:vAlign w:val="center"/>
-          </w:tcPr>
-          <w:p>
-            <w:pPr>
-              <w:spacing w:after="0" w:line="240" w:lineRule="auto"/>
-            </w:pPr>
-            <w:r>
-              <w:rPr>
-                <w:rFonts w:ascii="Arial" w:hAnsi="Arial"/>
-                <w:color w:val="202124"/>
-                <w:sz w:val="16"/>
-              </w:rPr>
-              <w:t>PK + FK</w:t>
-            </w:r>
-          </w:p>
-        </w:tc>
-        <w:tc>
-          <w:tcPr>
-            <w:tcW w:type="dxa" w:w="3210"/>
-            <w:shd w:fill="F8FAFB"/>
-            <w:tcMar>
-              <w:top w:w="90" w:type="dxa"/>
-              <w:start w:w="120" w:type="dxa"/>
-              <w:bottom w:w="90" w:type="dxa"/>
-              <w:end w:w="120" w:type="dxa"/>
-            </w:tcMar>
-            <w:vAlign w:val="center"/>
-          </w:tcPr>
-          <w:p>
-            <w:pPr>
-              <w:spacing w:after="0" w:line="240" w:lineRule="auto"/>
-            </w:pPr>
-            <w:r>
-              <w:rPr>
-                <w:rFonts w:ascii="Arial" w:hAnsi="Arial"/>
-                <w:color w:val="202124"/>
-                <w:sz w:val="16"/>
-              </w:rPr>
-              <w:t>Konijn, damhert of andere wilde grazer.</w:t>
-            </w:r>
-          </w:p>
-        </w:tc>
-      </w:tr>
-      <w:tr>
-        <w:trPr>
-          <w:cantSplit w:val="true"/>
-        </w:trPr>
-        <w:tc>
-          <w:tcPr>
-            <w:tcW w:type="dxa" w:w="1700"/>
-            <w:tcMar>
-              <w:top w:w="90" w:type="dxa"/>
-              <w:start w:w="120" w:type="dxa"/>
-              <w:bottom w:w="90" w:type="dxa"/>
-              <w:end w:w="120" w:type="dxa"/>
-            </w:tcMar>
-            <w:vAlign w:val="center"/>
-          </w:tcPr>
-          <w:p>
-            <w:pPr>
-              <w:spacing w:after="0" w:line="240" w:lineRule="auto"/>
-            </w:pPr>
-            <w:r>
-              <w:rPr>
-                <w:rFonts w:ascii="Arial" w:hAnsi="Arial"/>
-                <w:color w:val="202124"/>
-                <w:sz w:val="16"/>
-              </w:rPr>
-              <w:t>wildgrazer_meting</w:t>
-            </w:r>
-          </w:p>
-        </w:tc>
-        <w:tc>
-          <w:tcPr>
-            <w:tcW w:type="dxa" w:w="2550"/>
-            <w:tcMar>
-              <w:top w:w="90" w:type="dxa"/>
-              <w:start w:w="120" w:type="dxa"/>
-              <w:bottom w:w="90" w:type="dxa"/>
-              <w:end w:w="120" w:type="dxa"/>
-            </w:tcMar>
-            <w:vAlign w:val="center"/>
-          </w:tcPr>
-          <w:p>
-            <w:pPr>
-              <w:spacing w:after="0" w:line="240" w:lineRule="auto"/>
-            </w:pPr>
-            <w:r>
-              <w:rPr>
-                <w:rFonts w:ascii="Arial" w:hAnsi="Arial"/>
-                <w:color w:val="202124"/>
-                <w:sz w:val="16"/>
-              </w:rPr>
-              <w:t>soort, methode, datum, waarde, eenheid</w:t>
-            </w:r>
-          </w:p>
-        </w:tc>
-        <w:tc>
-          <w:tcPr>
-            <w:tcW w:type="dxa" w:w="1900"/>
-            <w:tcMar>
-              <w:top w:w="90" w:type="dxa"/>
-              <w:start w:w="120" w:type="dxa"/>
-              <w:bottom w:w="90" w:type="dxa"/>
-              <w:end w:w="120" w:type="dxa"/>
-            </w:tcMar>
-            <w:vAlign w:val="center"/>
-          </w:tcPr>
-          <w:p>
-            <w:pPr>
-              <w:spacing w:after="0" w:line="240" w:lineRule="auto"/>
-            </w:pPr>
-            <w:r>
-              <w:rPr>
-                <w:rFonts w:ascii="Arial" w:hAnsi="Arial"/>
-                <w:color w:val="202124"/>
-                <w:sz w:val="16"/>
-              </w:rPr>
-              <w:t>verplicht</w:t>
-            </w:r>
-          </w:p>
-        </w:tc>
-        <w:tc>
-          <w:tcPr>
-            <w:tcW w:type="dxa" w:w="3210"/>
-            <w:tcMar>
-              <w:top w:w="90" w:type="dxa"/>
-              <w:start w:w="120" w:type="dxa"/>
-              <w:bottom w:w="90" w:type="dxa"/>
-              <w:end w:w="120" w:type="dxa"/>
-            </w:tcMar>
-            <w:vAlign w:val="center"/>
-          </w:tcPr>
-          <w:p>
-            <w:pPr>
-              <w:spacing w:after="0" w:line="240" w:lineRule="auto"/>
-            </w:pPr>
-            <w:r>
-              <w:rPr>
-                <w:rFonts w:ascii="Arial" w:hAnsi="Arial"/>
-                <w:color w:val="202124"/>
-                <w:sz w:val="16"/>
-              </w:rPr>
-              <w:t>Index en echte dichtheid niet vermengen.</w:t>
-            </w:r>
-          </w:p>
-        </w:tc>
-      </w:tr>
-      <w:tr>
-        <w:trPr>
-          <w:cantSplit w:val="true"/>
-        </w:trPr>
-        <w:tc>
-          <w:tcPr>
-            <w:tcW w:type="dxa" w:w="1700"/>
-            <w:shd w:fill="F8FAFB"/>
-            <w:tcMar>
-              <w:top w:w="90" w:type="dxa"/>
-              <w:start w:w="120" w:type="dxa"/>
-              <w:bottom w:w="90" w:type="dxa"/>
-              <w:end w:w="120" w:type="dxa"/>
-            </w:tcMar>
-            <w:vAlign w:val="center"/>
-          </w:tcPr>
-          <w:p>
-            <w:pPr>
-              <w:spacing w:after="0" w:line="240" w:lineRule="auto"/>
-            </w:pPr>
-            <w:r>
-              <w:rPr>
-                <w:rFonts w:ascii="Arial" w:hAnsi="Arial"/>
-                <w:color w:val="202124"/>
-                <w:sz w:val="16"/>
-              </w:rPr>
-              <w:t>wildgrazer_meting</w:t>
-            </w:r>
-          </w:p>
-        </w:tc>
-        <w:tc>
-          <w:tcPr>
-            <w:tcW w:type="dxa" w:w="2550"/>
-            <w:shd w:fill="F8FAFB"/>
-            <w:tcMar>
-              <w:top w:w="90" w:type="dxa"/>
-              <w:start w:w="120" w:type="dxa"/>
-              <w:bottom w:w="90" w:type="dxa"/>
-              <w:end w:w="120" w:type="dxa"/>
-            </w:tcMar>
-            <w:vAlign w:val="center"/>
-          </w:tcPr>
-          <w:p>
-            <w:pPr>
-              <w:spacing w:after="0" w:line="240" w:lineRule="auto"/>
-            </w:pPr>
-            <w:r>
-              <w:rPr>
-                <w:rFonts w:ascii="Arial" w:hAnsi="Arial"/>
-                <w:color w:val="202124"/>
-                <w:sz w:val="16"/>
-              </w:rPr>
-              <w:t>ziekte_status, detectie_inspanning</w:t>
-            </w:r>
-          </w:p>
-        </w:tc>
-        <w:tc>
-          <w:tcPr>
-            <w:tcW w:type="dxa" w:w="1900"/>
-            <w:shd w:fill="F8FAFB"/>
-            <w:tcMar>
-              <w:top w:w="90" w:type="dxa"/>
-              <w:start w:w="120" w:type="dxa"/>
-              <w:bottom w:w="90" w:type="dxa"/>
-              <w:end w:w="120" w:type="dxa"/>
-            </w:tcMar>
-            <w:vAlign w:val="center"/>
-          </w:tcPr>
-          <w:p>
-            <w:pPr>
-              <w:spacing w:after="0" w:line="240" w:lineRule="auto"/>
-            </w:pPr>
-            <w:r>
-              <w:rPr>
-                <w:rFonts w:ascii="Arial" w:hAnsi="Arial"/>
-                <w:color w:val="202124"/>
-                <w:sz w:val="16"/>
-              </w:rPr>
-              <w:t>optioneel/verplicht</w:t>
-            </w:r>
-          </w:p>
-        </w:tc>
-        <w:tc>
-          <w:tcPr>
-            <w:tcW w:type="dxa" w:w="3210"/>
-            <w:shd w:fill="F8FAFB"/>
-            <w:tcMar>
-              <w:top w:w="90" w:type="dxa"/>
-              <w:start w:w="120" w:type="dxa"/>
-              <w:bottom w:w="90" w:type="dxa"/>
-              <w:end w:w="120" w:type="dxa"/>
-            </w:tcMar>
-            <w:vAlign w:val="center"/>
-          </w:tcPr>
-          <w:p>
-            <w:pPr>
-              <w:spacing w:after="0" w:line="240" w:lineRule="auto"/>
-            </w:pPr>
-            <w:r>
-              <w:rPr>
-                <w:rFonts w:ascii="Arial" w:hAnsi="Arial"/>
-                <w:color w:val="202124"/>
-                <w:sz w:val="16"/>
-              </w:rPr>
-              <w:t>Bij konijnen relevant voor trendinterpretatie.</w:t>
-            </w:r>
-          </w:p>
-        </w:tc>
-      </w:tr>
-      <w:tr>
-        <w:trPr>
-          <w:cantSplit w:val="true"/>
-        </w:trPr>
-        <w:tc>
-          <w:tcPr>
-            <w:tcW w:type="dxa" w:w="1700"/>
-            <w:tcMar>
-              <w:top w:w="90" w:type="dxa"/>
-              <w:start w:w="120" w:type="dxa"/>
-              <w:bottom w:w="90" w:type="dxa"/>
-              <w:end w:w="120" w:type="dxa"/>
-            </w:tcMar>
-            <w:vAlign w:val="center"/>
-          </w:tcPr>
-          <w:p>
-            <w:pPr>
-              <w:spacing w:after="0" w:line="240" w:lineRule="auto"/>
-            </w:pPr>
-            <w:r>
-              <w:rPr>
-                <w:rFonts w:ascii="Arial" w:hAnsi="Arial"/>
-                <w:color w:val="202124"/>
-                <w:sz w:val="16"/>
-              </w:rPr>
-              <w:t>omgevingsmeting</w:t>
-            </w:r>
-          </w:p>
-        </w:tc>
-        <w:tc>
-          <w:tcPr>
-            <w:tcW w:type="dxa" w:w="2550"/>
-            <w:tcMar>
-              <w:top w:w="90" w:type="dxa"/>
-              <w:start w:w="120" w:type="dxa"/>
-              <w:bottom w:w="90" w:type="dxa"/>
-              <w:end w:w="120" w:type="dxa"/>
-            </w:tcMar>
-            <w:vAlign w:val="center"/>
-          </w:tcPr>
-          <w:p>
-            <w:pPr>
-              <w:spacing w:after="0" w:line="240" w:lineRule="auto"/>
-            </w:pPr>
-            <w:r>
-              <w:rPr>
-                <w:rFonts w:ascii="Arial" w:hAnsi="Arial"/>
-                <w:color w:val="202124"/>
-                <w:sz w:val="16"/>
-              </w:rPr>
-              <w:t>omgevingsmeting_id, gebied/locatie</w:t>
-            </w:r>
-          </w:p>
-        </w:tc>
-        <w:tc>
-          <w:tcPr>
-            <w:tcW w:type="dxa" w:w="1900"/>
-            <w:tcMar>
-              <w:top w:w="90" w:type="dxa"/>
-              <w:start w:w="120" w:type="dxa"/>
-              <w:bottom w:w="90" w:type="dxa"/>
-              <w:end w:w="120" w:type="dxa"/>
-            </w:tcMar>
-            <w:vAlign w:val="center"/>
-          </w:tcPr>
-          <w:p>
-            <w:pPr>
-              <w:spacing w:after="0" w:line="240" w:lineRule="auto"/>
-            </w:pPr>
-            <w:r>
-              <w:rPr>
-                <w:rFonts w:ascii="Arial" w:hAnsi="Arial"/>
-                <w:color w:val="202124"/>
-                <w:sz w:val="16"/>
-              </w:rPr>
-              <w:t>PK + FK</w:t>
-            </w:r>
-          </w:p>
-        </w:tc>
-        <w:tc>
-          <w:tcPr>
-            <w:tcW w:type="dxa" w:w="3210"/>
-            <w:tcMar>
-              <w:top w:w="90" w:type="dxa"/>
-              <w:start w:w="120" w:type="dxa"/>
-              <w:bottom w:w="90" w:type="dxa"/>
-              <w:end w:w="120" w:type="dxa"/>
-            </w:tcMar>
-            <w:vAlign w:val="center"/>
-          </w:tcPr>
-          <w:p>
-            <w:pPr>
-              <w:spacing w:after="0" w:line="240" w:lineRule="auto"/>
-            </w:pPr>
-            <w:r>
-              <w:rPr>
-                <w:rFonts w:ascii="Arial" w:hAnsi="Arial"/>
-                <w:color w:val="202124"/>
-                <w:sz w:val="16"/>
-              </w:rPr>
-              <w:t>Ruimtelijke koppeling van externe context.</w:t>
-            </w:r>
-          </w:p>
-        </w:tc>
-      </w:tr>
-      <w:tr>
-        <w:trPr>
-          <w:cantSplit w:val="true"/>
-        </w:trPr>
-        <w:tc>
-          <w:tcPr>
-            <w:tcW w:type="dxa" w:w="1700"/>
-            <w:shd w:fill="F8FAFB"/>
-            <w:tcMar>
-              <w:top w:w="90" w:type="dxa"/>
-              <w:start w:w="120" w:type="dxa"/>
-              <w:bottom w:w="90" w:type="dxa"/>
-              <w:end w:w="120" w:type="dxa"/>
-            </w:tcMar>
-            <w:vAlign w:val="center"/>
-          </w:tcPr>
-          <w:p>
-            <w:pPr>
-              <w:spacing w:after="0" w:line="240" w:lineRule="auto"/>
-            </w:pPr>
-            <w:r>
-              <w:rPr>
-                <w:rFonts w:ascii="Arial" w:hAnsi="Arial"/>
-                <w:color w:val="202124"/>
-                <w:sz w:val="16"/>
-              </w:rPr>
-              <w:t>omgevingsmeting</w:t>
-            </w:r>
-          </w:p>
-        </w:tc>
-        <w:tc>
-          <w:tcPr>
-            <w:tcW w:type="dxa" w:w="2550"/>
-            <w:shd w:fill="F8FAFB"/>
-            <w:tcMar>
-              <w:top w:w="90" w:type="dxa"/>
-              <w:start w:w="120" w:type="dxa"/>
-              <w:bottom w:w="90" w:type="dxa"/>
-              <w:end w:w="120" w:type="dxa"/>
-            </w:tcMar>
-            <w:vAlign w:val="center"/>
-          </w:tcPr>
-          <w:p>
-            <w:pPr>
-              <w:spacing w:after="0" w:line="240" w:lineRule="auto"/>
-            </w:pPr>
-            <w:r>
-              <w:rPr>
-                <w:rFonts w:ascii="Arial" w:hAnsi="Arial"/>
-                <w:color w:val="202124"/>
-                <w:sz w:val="16"/>
-              </w:rPr>
-              <w:t>type, periode, waarde, eenheid, bron</w:t>
-            </w:r>
-          </w:p>
-        </w:tc>
-        <w:tc>
-          <w:tcPr>
-            <w:tcW w:type="dxa" w:w="1900"/>
-            <w:shd w:fill="F8FAFB"/>
-            <w:tcMar>
-              <w:top w:w="90" w:type="dxa"/>
-              <w:start w:w="120" w:type="dxa"/>
-              <w:bottom w:w="90" w:type="dxa"/>
-              <w:end w:w="120" w:type="dxa"/>
-            </w:tcMar>
-            <w:vAlign w:val="center"/>
-          </w:tcPr>
-          <w:p>
-            <w:pPr>
-              <w:spacing w:after="0" w:line="240" w:lineRule="auto"/>
-            </w:pPr>
-            <w:r>
-              <w:rPr>
-                <w:rFonts w:ascii="Arial" w:hAnsi="Arial"/>
-                <w:color w:val="202124"/>
-                <w:sz w:val="16"/>
-              </w:rPr>
-              <w:t>verplicht</w:t>
-            </w:r>
-          </w:p>
-        </w:tc>
-        <w:tc>
-          <w:tcPr>
-            <w:tcW w:type="dxa" w:w="3210"/>
-            <w:shd w:fill="F8FAFB"/>
-            <w:tcMar>
-              <w:top w:w="90" w:type="dxa"/>
-              <w:start w:w="120" w:type="dxa"/>
-              <w:bottom w:w="90" w:type="dxa"/>
-              <w:end w:w="120" w:type="dxa"/>
-            </w:tcMar>
-            <w:vAlign w:val="center"/>
-          </w:tcPr>
-          <w:p>
-            <w:pPr>
-              <w:spacing w:after="0" w:line="240" w:lineRule="auto"/>
-            </w:pPr>
-            <w:r>
-              <w:rPr>
-                <w:rFonts w:ascii="Arial" w:hAnsi="Arial"/>
-                <w:color w:val="202124"/>
-                <w:sz w:val="16"/>
-              </w:rPr>
-              <w:t>Droogte, neerslag, temperatuur, N-depositie, grondwater.</w:t>
+              <w:t>Versieerbare en controleerbare koppeling.</w:t>
             </w:r>
           </w:p>
         </w:tc>
@@ -9268,7 +6794,7 @@
                 <w:color w:val="202124"/>
                 <w:sz w:val="18"/>
               </w:rPr>
-              <w:t>beheermaatregel N — M gebiedsversie</w:t>
+              <w:t>begrazingsperiode N — M gebiedsversie</w:t>
             </w:r>
           </w:p>
         </w:tc>
@@ -9294,7 +6820,7 @@
                 <w:color w:val="202124"/>
                 <w:sz w:val="18"/>
               </w:rPr>
-              <w:t>Via maatregelgebied; één maatregel kan meerdere vlakken raken.</w:t>
+              <w:t>Via begrazingsgebied; één periode kan meerdere vlakken omvatten.</w:t>
             </w:r>
           </w:p>
         </w:tc>
@@ -9324,7 +6850,7 @@
                 <w:color w:val="202124"/>
                 <w:sz w:val="18"/>
               </w:rPr>
-              <w:t>beheermaatregel 1 — 0/1 begrazingsperiode</w:t>
+              <w:t>beheergebeurtenis 1 — 0/1 begrazingsperiode</w:t>
             </w:r>
           </w:p>
         </w:tc>
@@ -9349,7 +6875,7 @@
                 <w:color w:val="202124"/>
                 <w:sz w:val="18"/>
               </w:rPr>
-              <w:t>Alleen maatregelen van type begrazing hebben dit subtype.</w:t>
+              <w:t>Begrazing is in deze fase het enige uitgewerkte subtype.</w:t>
             </w:r>
           </w:p>
         </w:tc>
@@ -9548,7 +7074,7 @@
                 <w:color w:val="202124"/>
                 <w:sz w:val="18"/>
               </w:rPr>
-              <w:t>vergelijkingsopzet 1 — N vergelijkingsgebied</w:t>
+              <w:t>grazercategorie 1 — N gve_norm</w:t>
             </w:r>
           </w:p>
         </w:tc>
@@ -9573,7 +7099,7 @@
                 <w:color w:val="202124"/>
                 <w:sz w:val="18"/>
               </w:rPr>
-              <w:t>Minimaal één behandeld en één vergelijkingsgebied voor BACI.</w:t>
+              <w:t>Normwijzigingen worden historisch als nieuwe versie vastgelegd.</w:t>
             </w:r>
           </w:p>
         </w:tc>
@@ -9604,7 +7130,7 @@
                 <w:color w:val="202124"/>
                 <w:sz w:val="18"/>
               </w:rPr>
-              <w:t>meetlocatie 1 — N meetlocatieversie</w:t>
+              <w:t>kernentiteit 1 — N externe_koppeling</w:t>
             </w:r>
           </w:p>
         </w:tc>
@@ -9630,119 +7156,7 @@
                 <w:color w:val="202124"/>
                 <w:sz w:val="18"/>
               </w:rPr>
-              <w:t>De code blijft bestaan bij verplaatsing.</w:t>
-            </w:r>
-          </w:p>
-        </w:tc>
-      </w:tr>
-      <w:tr>
-        <w:trPr>
-          <w:cantSplit w:val="true"/>
-        </w:trPr>
-        <w:tc>
-          <w:tcPr>
-            <w:tcW w:type="dxa" w:w="3400"/>
-            <w:tcMar>
-              <w:top w:w="90" w:type="dxa"/>
-              <w:start w:w="120" w:type="dxa"/>
-              <w:bottom w:w="90" w:type="dxa"/>
-              <w:end w:w="120" w:type="dxa"/>
-            </w:tcMar>
-            <w:vAlign w:val="center"/>
-          </w:tcPr>
-          <w:p>
-            <w:pPr>
-              <w:spacing w:after="0" w:line="240" w:lineRule="auto"/>
-            </w:pPr>
-            <w:r>
-              <w:rPr>
-                <w:rFonts w:ascii="Arial" w:hAnsi="Arial"/>
-                <w:color w:val="202124"/>
-                <w:sz w:val="18"/>
-              </w:rPr>
-              <w:t>meetlocatieversie 1 — N meetbezoek</w:t>
-            </w:r>
-          </w:p>
-        </w:tc>
-        <w:tc>
-          <w:tcPr>
-            <w:tcW w:type="dxa" w:w="5960"/>
-            <w:tcMar>
-              <w:top w:w="90" w:type="dxa"/>
-              <w:start w:w="120" w:type="dxa"/>
-              <w:bottom w:w="90" w:type="dxa"/>
-              <w:end w:w="120" w:type="dxa"/>
-            </w:tcMar>
-            <w:vAlign w:val="center"/>
-          </w:tcPr>
-          <w:p>
-            <w:pPr>
-              <w:spacing w:after="0" w:line="240" w:lineRule="auto"/>
-            </w:pPr>
-            <w:r>
-              <w:rPr>
-                <w:rFonts w:ascii="Arial" w:hAnsi="Arial"/>
-                <w:color w:val="202124"/>
-                <w:sz w:val="18"/>
-              </w:rPr>
-              <w:t>Ieder bezoek gebruikt precies één geldige geometrische versie.</w:t>
-            </w:r>
-          </w:p>
-        </w:tc>
-      </w:tr>
-      <w:tr>
-        <w:trPr>
-          <w:cantSplit w:val="true"/>
-        </w:trPr>
-        <w:tc>
-          <w:tcPr>
-            <w:tcW w:type="dxa" w:w="3400"/>
-            <w:shd w:fill="F8FAFB"/>
-            <w:tcMar>
-              <w:top w:w="90" w:type="dxa"/>
-              <w:start w:w="120" w:type="dxa"/>
-              <w:bottom w:w="90" w:type="dxa"/>
-              <w:end w:w="120" w:type="dxa"/>
-            </w:tcMar>
-            <w:vAlign w:val="center"/>
-          </w:tcPr>
-          <w:p>
-            <w:pPr>
-              <w:spacing w:after="0" w:line="240" w:lineRule="auto"/>
-            </w:pPr>
-            <w:r>
-              <w:rPr>
-                <w:rFonts w:ascii="Arial" w:hAnsi="Arial"/>
-                <w:color w:val="202124"/>
-                <w:sz w:val="18"/>
-              </w:rPr>
-              <w:t>meetbezoek 1 — N externe koppeling</w:t>
-            </w:r>
-          </w:p>
-        </w:tc>
-        <w:tc>
-          <w:tcPr>
-            <w:tcW w:type="dxa" w:w="5960"/>
-            <w:shd w:fill="F8FAFB"/>
-            <w:tcMar>
-              <w:top w:w="90" w:type="dxa"/>
-              <w:start w:w="120" w:type="dxa"/>
-              <w:bottom w:w="90" w:type="dxa"/>
-              <w:end w:w="120" w:type="dxa"/>
-            </w:tcMar>
-            <w:vAlign w:val="center"/>
-          </w:tcPr>
-          <w:p>
-            <w:pPr>
-              <w:spacing w:after="0" w:line="240" w:lineRule="auto"/>
-            </w:pPr>
-            <w:r>
-              <w:rPr>
-                <w:rFonts w:ascii="Arial" w:hAnsi="Arial"/>
-                <w:color w:val="202124"/>
-                <w:sz w:val="18"/>
-              </w:rPr>
-              <w:t>Eén bezoek kan vegetatie-, fauna- en andere datasets verbinden.</w:t>
+              <w:t>Een gebied, periode of fase kan meerdere externe sleutels hebben.</w:t>
             </w:r>
           </w:p>
         </w:tc>
@@ -9859,7 +7273,7 @@
           <w:color w:val="202124"/>
           <w:sz w:val="21"/>
         </w:rPr>
-        <w:t>Bij dezelfde veebezetting kan de feitelijke consumptie verschillen door droogte, biomassa, voedselkwaliteit, reliëf, watervoorzieningen, grazerkeuze en de aanwezigheid van konijnen of damherten. Indien later biomassa vóór en na begrazing wordt gemeten, kan een aanvullende gevalideerde graasdrukmaat worden toegevoegd met methode en onzekerheid.</w:t>
+        <w:t>De berekening beschrijft de administratieve veebezetting, niet hoeveel daadwerkelijk is gegeten. Noem het veld daarom veebezetting_gve_ha_jaar. Een eventuele toekomstige, extern bepaalde graasdrukmaat kan via een koppelsleutel worden verbonden; zij behoort nu niet tot dit model.</w:t>
       </w:r>
     </w:p>
     <w:p>
@@ -9882,7 +7296,7 @@
           <w:color w:val="202124"/>
           <w:sz w:val="21"/>
         </w:rPr>
-        <w:t>Voor een meetlocatie kan per dag of fase ruimtelijk worden bepaald welk beheer daar gold door de locatiegeometrie te kruisen met toegankelijk gebied, maatregelvlakken en eventueel een GPS-gebruiksraster. De database moet de brongeometrieën bewaren; afgeleide overlaps kunnen opnieuw worden berekend.</w:t>
+        <w:t>Voor iedere locatie en datum moet kunnen worden bepaald welke begrazingsfase daar gold. Dat gebeurt door de locatie later te kruisen met het geldige begrazingsgebied en, indien aanwezig, een nauwkeuriger toegankelijk vlak of GPS-gebruiksraster. Bewaar de brongeometrieën; afgeleide overlaps moeten opnieuw berekenbaar blijven.</w:t>
       </w:r>
     </w:p>
     <w:p>
@@ -10073,7 +7487,7 @@
                 <w:color w:val="202124"/>
                 <w:sz w:val="16"/>
               </w:rPr>
-              <w:t>Gebieden en fasen</w:t>
+              <w:t>Gebiedsidentiteit</w:t>
             </w:r>
           </w:p>
         </w:tc>
@@ -10098,7 +7512,7 @@
                 <w:color w:val="202124"/>
                 <w:sz w:val="16"/>
               </w:rPr>
-              <w:t>Stabiele code; versiebegrenzing; netto toegankelijk vlak; begin/einde; regime; onderbrekingen; exclosures.</w:t>
+              <w:t>Stabiele code, naam, status, beheerder en bron.</w:t>
             </w:r>
           </w:p>
         </w:tc>
@@ -10123,7 +7537,435 @@
                 <w:color w:val="202124"/>
                 <w:sz w:val="16"/>
               </w:rPr>
-              <w:t>Bij iedere wijziging</w:t>
+              <w:t>Bij aanmaak/wijziging</w:t>
+            </w:r>
+          </w:p>
+        </w:tc>
+      </w:tr>
+      <w:tr>
+        <w:trPr>
+          <w:cantSplit w:val="true"/>
+        </w:trPr>
+        <w:tc>
+          <w:tcPr>
+            <w:tcW w:type="dxa" w:w="1400"/>
+            <w:shd w:fill="F8FAFB"/>
+            <w:tcMar>
+              <w:top w:w="90" w:type="dxa"/>
+              <w:start w:w="120" w:type="dxa"/>
+              <w:bottom w:w="90" w:type="dxa"/>
+              <w:end w:w="120" w:type="dxa"/>
+            </w:tcMar>
+            <w:vAlign w:val="center"/>
+          </w:tcPr>
+          <w:p>
+            <w:pPr>
+              <w:spacing w:after="0" w:line="240" w:lineRule="auto"/>
+            </w:pPr>
+            <w:r>
+              <w:rPr>
+                <w:rFonts w:ascii="Arial" w:hAnsi="Arial"/>
+                <w:color w:val="202124"/>
+                <w:sz w:val="16"/>
+              </w:rPr>
+              <w:t>1. Verplicht</w:t>
+            </w:r>
+          </w:p>
+        </w:tc>
+        <w:tc>
+          <w:tcPr>
+            <w:tcW w:type="dxa" w:w="1700"/>
+            <w:shd w:fill="F8FAFB"/>
+            <w:tcMar>
+              <w:top w:w="90" w:type="dxa"/>
+              <w:start w:w="120" w:type="dxa"/>
+              <w:bottom w:w="90" w:type="dxa"/>
+              <w:end w:w="120" w:type="dxa"/>
+            </w:tcMar>
+            <w:vAlign w:val="center"/>
+          </w:tcPr>
+          <w:p>
+            <w:pPr>
+              <w:spacing w:after="0" w:line="240" w:lineRule="auto"/>
+            </w:pPr>
+            <w:r>
+              <w:rPr>
+                <w:rFonts w:ascii="Arial" w:hAnsi="Arial"/>
+                <w:color w:val="202124"/>
+                <w:sz w:val="16"/>
+              </w:rPr>
+              <w:t>Gebiedsversie</w:t>
+            </w:r>
+          </w:p>
+        </w:tc>
+        <w:tc>
+          <w:tcPr>
+            <w:tcW w:type="dxa" w:w="4560"/>
+            <w:shd w:fill="F8FAFB"/>
+            <w:tcMar>
+              <w:top w:w="90" w:type="dxa"/>
+              <w:start w:w="120" w:type="dxa"/>
+              <w:bottom w:w="90" w:type="dxa"/>
+              <w:end w:w="120" w:type="dxa"/>
+            </w:tcMar>
+            <w:vAlign w:val="center"/>
+          </w:tcPr>
+          <w:p>
+            <w:pPr>
+              <w:spacing w:after="0" w:line="240" w:lineRule="auto"/>
+            </w:pPr>
+            <w:r>
+              <w:rPr>
+                <w:rFonts w:ascii="Arial" w:hAnsi="Arial"/>
+                <w:color w:val="202124"/>
+                <w:sz w:val="16"/>
+              </w:rPr>
+              <w:t>Geldig van/tot, begrenzing, oppervlakte, bron, nauwkeurigheid en wijzigingsreden.</w:t>
+            </w:r>
+          </w:p>
+        </w:tc>
+        <w:tc>
+          <w:tcPr>
+            <w:tcW w:type="dxa" w:w="1700"/>
+            <w:shd w:fill="F8FAFB"/>
+            <w:tcMar>
+              <w:top w:w="90" w:type="dxa"/>
+              <w:start w:w="120" w:type="dxa"/>
+              <w:bottom w:w="90" w:type="dxa"/>
+              <w:end w:w="120" w:type="dxa"/>
+            </w:tcMar>
+            <w:vAlign w:val="center"/>
+          </w:tcPr>
+          <w:p>
+            <w:pPr>
+              <w:spacing w:after="0" w:line="240" w:lineRule="auto"/>
+            </w:pPr>
+            <w:r>
+              <w:rPr>
+                <w:rFonts w:ascii="Arial" w:hAnsi="Arial"/>
+                <w:color w:val="202124"/>
+                <w:sz w:val="16"/>
+              </w:rPr>
+              <w:t>Bij iedere grenswijziging</w:t>
+            </w:r>
+          </w:p>
+        </w:tc>
+      </w:tr>
+      <w:tr>
+        <w:trPr>
+          <w:cantSplit w:val="true"/>
+        </w:trPr>
+        <w:tc>
+          <w:tcPr>
+            <w:tcW w:type="dxa" w:w="1400"/>
+            <w:tcMar>
+              <w:top w:w="90" w:type="dxa"/>
+              <w:start w:w="120" w:type="dxa"/>
+              <w:bottom w:w="90" w:type="dxa"/>
+              <w:end w:w="120" w:type="dxa"/>
+            </w:tcMar>
+            <w:vAlign w:val="center"/>
+          </w:tcPr>
+          <w:p>
+            <w:pPr>
+              <w:spacing w:after="0" w:line="240" w:lineRule="auto"/>
+            </w:pPr>
+            <w:r>
+              <w:rPr>
+                <w:rFonts w:ascii="Arial" w:hAnsi="Arial"/>
+                <w:color w:val="202124"/>
+                <w:sz w:val="16"/>
+              </w:rPr>
+              <w:t>1. Verplicht</w:t>
+            </w:r>
+          </w:p>
+        </w:tc>
+        <w:tc>
+          <w:tcPr>
+            <w:tcW w:type="dxa" w:w="1700"/>
+            <w:tcMar>
+              <w:top w:w="90" w:type="dxa"/>
+              <w:start w:w="120" w:type="dxa"/>
+              <w:bottom w:w="90" w:type="dxa"/>
+              <w:end w:w="120" w:type="dxa"/>
+            </w:tcMar>
+            <w:vAlign w:val="center"/>
+          </w:tcPr>
+          <w:p>
+            <w:pPr>
+              <w:spacing w:after="0" w:line="240" w:lineRule="auto"/>
+            </w:pPr>
+            <w:r>
+              <w:rPr>
+                <w:rFonts w:ascii="Arial" w:hAnsi="Arial"/>
+                <w:color w:val="202124"/>
+                <w:sz w:val="16"/>
+              </w:rPr>
+              <w:t>Begrazingsperiode</w:t>
+            </w:r>
+          </w:p>
+        </w:tc>
+        <w:tc>
+          <w:tcPr>
+            <w:tcW w:type="dxa" w:w="4560"/>
+            <w:tcMar>
+              <w:top w:w="90" w:type="dxa"/>
+              <w:start w:w="120" w:type="dxa"/>
+              <w:bottom w:w="90" w:type="dxa"/>
+              <w:end w:w="120" w:type="dxa"/>
+            </w:tcMar>
+            <w:vAlign w:val="center"/>
+          </w:tcPr>
+          <w:p>
+            <w:pPr>
+              <w:spacing w:after="0" w:line="240" w:lineRule="auto"/>
+            </w:pPr>
+            <w:r>
+              <w:rPr>
+                <w:rFonts w:ascii="Arial" w:hAnsi="Arial"/>
+                <w:color w:val="202124"/>
+                <w:sz w:val="16"/>
+              </w:rPr>
+              <w:t>Regime, uitvoeringsvorm, doel, plan- en werkelijke begin/einddatum en status.</w:t>
+            </w:r>
+          </w:p>
+        </w:tc>
+        <w:tc>
+          <w:tcPr>
+            <w:tcW w:type="dxa" w:w="1700"/>
+            <w:tcMar>
+              <w:top w:w="90" w:type="dxa"/>
+              <w:start w:w="120" w:type="dxa"/>
+              <w:bottom w:w="90" w:type="dxa"/>
+              <w:end w:w="120" w:type="dxa"/>
+            </w:tcMar>
+            <w:vAlign w:val="center"/>
+          </w:tcPr>
+          <w:p>
+            <w:pPr>
+              <w:spacing w:after="0" w:line="240" w:lineRule="auto"/>
+            </w:pPr>
+            <w:r>
+              <w:rPr>
+                <w:rFonts w:ascii="Arial" w:hAnsi="Arial"/>
+                <w:color w:val="202124"/>
+                <w:sz w:val="16"/>
+              </w:rPr>
+              <w:t>Per periode</w:t>
+            </w:r>
+          </w:p>
+        </w:tc>
+      </w:tr>
+      <w:tr>
+        <w:trPr>
+          <w:cantSplit w:val="true"/>
+        </w:trPr>
+        <w:tc>
+          <w:tcPr>
+            <w:tcW w:type="dxa" w:w="1400"/>
+            <w:shd w:fill="F8FAFB"/>
+            <w:tcMar>
+              <w:top w:w="90" w:type="dxa"/>
+              <w:start w:w="120" w:type="dxa"/>
+              <w:bottom w:w="90" w:type="dxa"/>
+              <w:end w:w="120" w:type="dxa"/>
+            </w:tcMar>
+            <w:vAlign w:val="center"/>
+          </w:tcPr>
+          <w:p>
+            <w:pPr>
+              <w:spacing w:after="0" w:line="240" w:lineRule="auto"/>
+            </w:pPr>
+            <w:r>
+              <w:rPr>
+                <w:rFonts w:ascii="Arial" w:hAnsi="Arial"/>
+                <w:color w:val="202124"/>
+                <w:sz w:val="16"/>
+              </w:rPr>
+              <w:t>1. Verplicht</w:t>
+            </w:r>
+          </w:p>
+        </w:tc>
+        <w:tc>
+          <w:tcPr>
+            <w:tcW w:type="dxa" w:w="1700"/>
+            <w:shd w:fill="F8FAFB"/>
+            <w:tcMar>
+              <w:top w:w="90" w:type="dxa"/>
+              <w:start w:w="120" w:type="dxa"/>
+              <w:bottom w:w="90" w:type="dxa"/>
+              <w:end w:w="120" w:type="dxa"/>
+            </w:tcMar>
+            <w:vAlign w:val="center"/>
+          </w:tcPr>
+          <w:p>
+            <w:pPr>
+              <w:spacing w:after="0" w:line="240" w:lineRule="auto"/>
+            </w:pPr>
+            <w:r>
+              <w:rPr>
+                <w:rFonts w:ascii="Arial" w:hAnsi="Arial"/>
+                <w:color w:val="202124"/>
+                <w:sz w:val="16"/>
+              </w:rPr>
+              <w:t>Begrazingsgebied</w:t>
+            </w:r>
+          </w:p>
+        </w:tc>
+        <w:tc>
+          <w:tcPr>
+            <w:tcW w:type="dxa" w:w="4560"/>
+            <w:shd w:fill="F8FAFB"/>
+            <w:tcMar>
+              <w:top w:w="90" w:type="dxa"/>
+              <w:start w:w="120" w:type="dxa"/>
+              <w:bottom w:w="90" w:type="dxa"/>
+              <w:end w:w="120" w:type="dxa"/>
+            </w:tcMar>
+            <w:vAlign w:val="center"/>
+          </w:tcPr>
+          <w:p>
+            <w:pPr>
+              <w:spacing w:after="0" w:line="240" w:lineRule="auto"/>
+            </w:pPr>
+            <w:r>
+              <w:rPr>
+                <w:rFonts w:ascii="Arial" w:hAnsi="Arial"/>
+                <w:color w:val="202124"/>
+                <w:sz w:val="16"/>
+              </w:rPr>
+              <w:t>Koppeling met geldige gebiedsversie, werkelijk toegankelijk hoofdvlak en oppervlakte.</w:t>
+            </w:r>
+          </w:p>
+        </w:tc>
+        <w:tc>
+          <w:tcPr>
+            <w:tcW w:type="dxa" w:w="1700"/>
+            <w:shd w:fill="F8FAFB"/>
+            <w:tcMar>
+              <w:top w:w="90" w:type="dxa"/>
+              <w:start w:w="120" w:type="dxa"/>
+              <w:bottom w:w="90" w:type="dxa"/>
+              <w:end w:w="120" w:type="dxa"/>
+            </w:tcMar>
+            <w:vAlign w:val="center"/>
+          </w:tcPr>
+          <w:p>
+            <w:pPr>
+              <w:spacing w:after="0" w:line="240" w:lineRule="auto"/>
+            </w:pPr>
+            <w:r>
+              <w:rPr>
+                <w:rFonts w:ascii="Arial" w:hAnsi="Arial"/>
+                <w:color w:val="202124"/>
+                <w:sz w:val="16"/>
+              </w:rPr>
+              <w:t>Per periode en wijziging</w:t>
+            </w:r>
+          </w:p>
+        </w:tc>
+      </w:tr>
+      <w:tr>
+        <w:trPr>
+          <w:cantSplit w:val="true"/>
+        </w:trPr>
+        <w:tc>
+          <w:tcPr>
+            <w:tcW w:type="dxa" w:w="1400"/>
+            <w:tcMar>
+              <w:top w:w="90" w:type="dxa"/>
+              <w:start w:w="120" w:type="dxa"/>
+              <w:bottom w:w="90" w:type="dxa"/>
+              <w:end w:w="120" w:type="dxa"/>
+            </w:tcMar>
+            <w:vAlign w:val="center"/>
+          </w:tcPr>
+          <w:p>
+            <w:pPr>
+              <w:spacing w:after="0" w:line="240" w:lineRule="auto"/>
+            </w:pPr>
+            <w:r>
+              <w:rPr>
+                <w:rFonts w:ascii="Arial" w:hAnsi="Arial"/>
+                <w:color w:val="202124"/>
+                <w:sz w:val="16"/>
+              </w:rPr>
+              <w:t>1. Verplicht</w:t>
+            </w:r>
+          </w:p>
+        </w:tc>
+        <w:tc>
+          <w:tcPr>
+            <w:tcW w:type="dxa" w:w="1700"/>
+            <w:tcMar>
+              <w:top w:w="90" w:type="dxa"/>
+              <w:start w:w="120" w:type="dxa"/>
+              <w:bottom w:w="90" w:type="dxa"/>
+              <w:end w:w="120" w:type="dxa"/>
+            </w:tcMar>
+            <w:vAlign w:val="center"/>
+          </w:tcPr>
+          <w:p>
+            <w:pPr>
+              <w:spacing w:after="0" w:line="240" w:lineRule="auto"/>
+            </w:pPr>
+            <w:r>
+              <w:rPr>
+                <w:rFonts w:ascii="Arial" w:hAnsi="Arial"/>
+                <w:color w:val="202124"/>
+                <w:sz w:val="16"/>
+              </w:rPr>
+              <w:t>Begrazingsfase</w:t>
+            </w:r>
+          </w:p>
+        </w:tc>
+        <w:tc>
+          <w:tcPr>
+            <w:tcW w:type="dxa" w:w="4560"/>
+            <w:tcMar>
+              <w:top w:w="90" w:type="dxa"/>
+              <w:start w:w="120" w:type="dxa"/>
+              <w:bottom w:w="90" w:type="dxa"/>
+              <w:end w:w="120" w:type="dxa"/>
+            </w:tcMar>
+            <w:vAlign w:val="center"/>
+          </w:tcPr>
+          <w:p>
+            <w:pPr>
+              <w:spacing w:after="0" w:line="240" w:lineRule="auto"/>
+            </w:pPr>
+            <w:r>
+              <w:rPr>
+                <w:rFonts w:ascii="Arial" w:hAnsi="Arial"/>
+                <w:color w:val="202124"/>
+                <w:sz w:val="16"/>
+              </w:rPr>
+              <w:t>Begin/einde, begrazing of onderbreking, netto toegankelijk vlak/ha, reden wijziging en zekerheid.</w:t>
+            </w:r>
+          </w:p>
+        </w:tc>
+        <w:tc>
+          <w:tcPr>
+            <w:tcW w:type="dxa" w:w="1700"/>
+            <w:tcMar>
+              <w:top w:w="90" w:type="dxa"/>
+              <w:start w:w="120" w:type="dxa"/>
+              <w:bottom w:w="90" w:type="dxa"/>
+              <w:end w:w="120" w:type="dxa"/>
+            </w:tcMar>
+            <w:vAlign w:val="center"/>
+          </w:tcPr>
+          <w:p>
+            <w:pPr>
+              <w:spacing w:after="0" w:line="240" w:lineRule="auto"/>
+            </w:pPr>
+            <w:r>
+              <w:rPr>
+                <w:rFonts w:ascii="Arial" w:hAnsi="Arial"/>
+                <w:color w:val="202124"/>
+                <w:sz w:val="16"/>
+              </w:rPr>
+              <w:t>Bij iedere relevante wijziging</w:t>
             </w:r>
           </w:p>
         </w:tc>
@@ -10206,7 +8048,7 @@
                 <w:color w:val="202124"/>
                 <w:sz w:val="16"/>
               </w:rPr>
-              <w:t>Soort, ras, geslacht, leeftijd/gewichtsklasse, aantal, individuele of groepsmutaties, gebruikte GVE-norm.</w:t>
+              <w:t>Soort, ras waar relevant, geslacht, leeftijds-/gewichtsklasse, aantal en aantalstatus.</w:t>
             </w:r>
           </w:p>
         </w:tc>
@@ -10232,7 +8074,7 @@
                 <w:color w:val="202124"/>
                 <w:sz w:val="16"/>
               </w:rPr>
-              <w:t>Bij in/uitscharen en controle</w:t>
+              <w:t>Bij in- en uitscharen en mutatie</w:t>
             </w:r>
           </w:p>
         </w:tc>
@@ -10287,7 +8129,7 @@
                 <w:color w:val="202124"/>
                 <w:sz w:val="16"/>
               </w:rPr>
-              <w:t>Werkelijkheid</w:t>
+              <w:t>GVE-norm</w:t>
             </w:r>
           </w:p>
         </w:tc>
@@ -10312,7 +8154,7 @@
                 <w:color w:val="202124"/>
                 <w:sz w:val="16"/>
               </w:rPr>
-              <w:t>Plan versus werkelijk; open hek; achtergebleven dier; afwijkend maaien; verplaatste afrastering; oorzaak en zekerheid.</w:t>
+              <w:t>Factor, geldigheidsperiode, bron en gebruikte categorie.</w:t>
             </w:r>
           </w:p>
         </w:tc>
@@ -10337,7 +8179,7 @@
                 <w:color w:val="202124"/>
                 <w:sz w:val="16"/>
               </w:rPr>
-              <w:t>Direct na constatering</w:t>
+              <w:t>Bij eerste gebruik/normwijziging</w:t>
             </w:r>
           </w:p>
         </w:tc>
@@ -10394,7 +8236,7 @@
                 <w:color w:val="202124"/>
                 <w:sz w:val="16"/>
               </w:rPr>
-              <w:t>Andere maatregelen</w:t>
+              <w:t>Werkelijke uitvoering</w:t>
             </w:r>
           </w:p>
         </w:tc>
@@ -10420,7 +8262,7 @@
                 <w:color w:val="202124"/>
                 <w:sz w:val="16"/>
               </w:rPr>
-              <w:t>Maaien, plaggen, chopperen, struweel verwijderen, stuifplekken en rasterwerk met exacte tijd en geometrie.</w:t>
+              <w:t>Verwacht versus werkelijk, tijd, locatie, oorzaak, impact, bron en zekerheidsstatus.</w:t>
             </w:r>
           </w:p>
         </w:tc>
@@ -10446,7 +8288,7 @@
                 <w:color w:val="202124"/>
                 <w:sz w:val="16"/>
               </w:rPr>
-              <w:t>Per ingreep</w:t>
+              <w:t>Direct na constatering</w:t>
             </w:r>
           </w:p>
         </w:tc>
@@ -10501,7 +8343,7 @@
                 <w:color w:val="202124"/>
                 <w:sz w:val="16"/>
               </w:rPr>
-              <w:t>Meetmetadata</w:t>
+              <w:t>Herkomst en audit</w:t>
             </w:r>
           </w:p>
         </w:tc>
@@ -10526,7 +8368,7 @@
                 <w:color w:val="202124"/>
                 <w:sz w:val="16"/>
               </w:rPr>
-              <w:t>Stabiele locatie, locatieversie, protocolversie, datum, inspanning, waarnemer, omstandigheden, kwaliteit.</w:t>
+              <w:t>Bronhouder, ingevoerd op/door, gecontroleerd op/door en correctiereden.</w:t>
             </w:r>
           </w:p>
         </w:tc>
@@ -10551,221 +8393,7 @@
                 <w:color w:val="202124"/>
                 <w:sz w:val="16"/>
               </w:rPr>
-              <w:t>Per meetbezoek</w:t>
-            </w:r>
-          </w:p>
-        </w:tc>
-      </w:tr>
-      <w:tr>
-        <w:trPr>
-          <w:cantSplit w:val="true"/>
-        </w:trPr>
-        <w:tc>
-          <w:tcPr>
-            <w:tcW w:type="dxa" w:w="1400"/>
-            <w:shd w:fill="F8FAFB"/>
-            <w:tcMar>
-              <w:top w:w="90" w:type="dxa"/>
-              <w:start w:w="120" w:type="dxa"/>
-              <w:bottom w:w="90" w:type="dxa"/>
-              <w:end w:w="120" w:type="dxa"/>
-            </w:tcMar>
-            <w:vAlign w:val="center"/>
-          </w:tcPr>
-          <w:p>
-            <w:pPr>
-              <w:spacing w:after="0" w:line="240" w:lineRule="auto"/>
-            </w:pPr>
-            <w:r>
-              <w:rPr>
-                <w:rFonts w:ascii="Arial" w:hAnsi="Arial"/>
-                <w:color w:val="202124"/>
-                <w:sz w:val="16"/>
-              </w:rPr>
-              <w:t>1. Verplicht</w:t>
-            </w:r>
-          </w:p>
-        </w:tc>
-        <w:tc>
-          <w:tcPr>
-            <w:tcW w:type="dxa" w:w="1700"/>
-            <w:shd w:fill="F8FAFB"/>
-            <w:tcMar>
-              <w:top w:w="90" w:type="dxa"/>
-              <w:start w:w="120" w:type="dxa"/>
-              <w:bottom w:w="90" w:type="dxa"/>
-              <w:end w:w="120" w:type="dxa"/>
-            </w:tcMar>
-            <w:vAlign w:val="center"/>
-          </w:tcPr>
-          <w:p>
-            <w:pPr>
-              <w:spacing w:after="0" w:line="240" w:lineRule="auto"/>
-            </w:pPr>
-            <w:r>
-              <w:rPr>
-                <w:rFonts w:ascii="Arial" w:hAnsi="Arial"/>
-                <w:color w:val="202124"/>
-                <w:sz w:val="16"/>
-              </w:rPr>
-              <w:t>Vergelijking</w:t>
-            </w:r>
-          </w:p>
-        </w:tc>
-        <w:tc>
-          <w:tcPr>
-            <w:tcW w:type="dxa" w:w="4560"/>
-            <w:shd w:fill="F8FAFB"/>
-            <w:tcMar>
-              <w:top w:w="90" w:type="dxa"/>
-              <w:start w:w="120" w:type="dxa"/>
-              <w:bottom w:w="90" w:type="dxa"/>
-              <w:end w:w="120" w:type="dxa"/>
-            </w:tcMar>
-            <w:vAlign w:val="center"/>
-          </w:tcPr>
-          <w:p>
-            <w:pPr>
-              <w:spacing w:after="0" w:line="240" w:lineRule="auto"/>
-            </w:pPr>
-            <w:r>
-              <w:rPr>
-                <w:rFonts w:ascii="Arial" w:hAnsi="Arial"/>
-                <w:color w:val="202124"/>
-                <w:sz w:val="16"/>
-              </w:rPr>
-              <w:t>Behandeling, controle of referentie; vergelijkbaarheid; begin/einde rol; eerste echte voor-meting.</w:t>
-            </w:r>
-          </w:p>
-        </w:tc>
-        <w:tc>
-          <w:tcPr>
-            <w:tcW w:type="dxa" w:w="1700"/>
-            <w:shd w:fill="F8FAFB"/>
-            <w:tcMar>
-              <w:top w:w="90" w:type="dxa"/>
-              <w:start w:w="120" w:type="dxa"/>
-              <w:bottom w:w="90" w:type="dxa"/>
-              <w:end w:w="120" w:type="dxa"/>
-            </w:tcMar>
-            <w:vAlign w:val="center"/>
-          </w:tcPr>
-          <w:p>
-            <w:pPr>
-              <w:spacing w:after="0" w:line="240" w:lineRule="auto"/>
-            </w:pPr>
-            <w:r>
-              <w:rPr>
-                <w:rFonts w:ascii="Arial" w:hAnsi="Arial"/>
-                <w:color w:val="202124"/>
-                <w:sz w:val="16"/>
-              </w:rPr>
-              <w:t>Bij start/wijziging</w:t>
-            </w:r>
-          </w:p>
-        </w:tc>
-      </w:tr>
-      <w:tr>
-        <w:trPr>
-          <w:cantSplit w:val="true"/>
-        </w:trPr>
-        <w:tc>
-          <w:tcPr>
-            <w:tcW w:type="dxa" w:w="1400"/>
-            <w:tcMar>
-              <w:top w:w="90" w:type="dxa"/>
-              <w:start w:w="120" w:type="dxa"/>
-              <w:bottom w:w="90" w:type="dxa"/>
-              <w:end w:w="120" w:type="dxa"/>
-            </w:tcMar>
-            <w:vAlign w:val="center"/>
-          </w:tcPr>
-          <w:p>
-            <w:pPr>
-              <w:spacing w:after="0" w:line="240" w:lineRule="auto"/>
-            </w:pPr>
-            <w:r>
-              <w:rPr>
-                <w:rFonts w:ascii="Arial" w:hAnsi="Arial"/>
-                <w:color w:val="202124"/>
-                <w:sz w:val="16"/>
-              </w:rPr>
-              <w:t>2. Sterk aanbevolen</w:t>
-            </w:r>
-          </w:p>
-        </w:tc>
-        <w:tc>
-          <w:tcPr>
-            <w:tcW w:type="dxa" w:w="1700"/>
-            <w:tcMar>
-              <w:top w:w="90" w:type="dxa"/>
-              <w:start w:w="120" w:type="dxa"/>
-              <w:bottom w:w="90" w:type="dxa"/>
-              <w:end w:w="120" w:type="dxa"/>
-            </w:tcMar>
-            <w:vAlign w:val="center"/>
-          </w:tcPr>
-          <w:p>
-            <w:pPr>
-              <w:spacing w:after="0" w:line="240" w:lineRule="auto"/>
-            </w:pPr>
-            <w:r>
-              <w:rPr>
-                <w:rFonts w:ascii="Arial" w:hAnsi="Arial"/>
-                <w:color w:val="202124"/>
-                <w:sz w:val="16"/>
-              </w:rPr>
-              <w:t>Vegetatiestructuur</w:t>
-            </w:r>
-          </w:p>
-        </w:tc>
-        <w:tc>
-          <w:tcPr>
-            <w:tcW w:type="dxa" w:w="4560"/>
-            <w:tcMar>
-              <w:top w:w="90" w:type="dxa"/>
-              <w:start w:w="120" w:type="dxa"/>
-              <w:bottom w:w="90" w:type="dxa"/>
-              <w:end w:w="120" w:type="dxa"/>
-            </w:tcMar>
-            <w:vAlign w:val="center"/>
-          </w:tcPr>
-          <w:p>
-            <w:pPr>
-              <w:spacing w:after="0" w:line="240" w:lineRule="auto"/>
-            </w:pPr>
-            <w:r>
-              <w:rPr>
-                <w:rFonts w:ascii="Arial" w:hAnsi="Arial"/>
-                <w:color w:val="202124"/>
-                <w:sz w:val="16"/>
-              </w:rPr>
-              <w:t>Hoogte én variatie; open zand; mos; gras; kruiden/ruigte; struweel; strooisel; bloemaanbod.</w:t>
-            </w:r>
-          </w:p>
-        </w:tc>
-        <w:tc>
-          <w:tcPr>
-            <w:tcW w:type="dxa" w:w="1700"/>
-            <w:tcMar>
-              <w:top w:w="90" w:type="dxa"/>
-              <w:start w:w="120" w:type="dxa"/>
-              <w:bottom w:w="90" w:type="dxa"/>
-              <w:end w:w="120" w:type="dxa"/>
-            </w:tcMar>
-            <w:vAlign w:val="center"/>
-          </w:tcPr>
-          <w:p>
-            <w:pPr>
-              <w:spacing w:after="0" w:line="240" w:lineRule="auto"/>
-            </w:pPr>
-            <w:r>
-              <w:rPr>
-                <w:rFonts w:ascii="Arial" w:hAnsi="Arial"/>
-                <w:color w:val="202124"/>
-                <w:sz w:val="16"/>
-              </w:rPr>
-              <w:t>Jaarlijks vast seizoen</w:t>
+              <w:t>Per record/correctie</w:t>
             </w:r>
           </w:p>
         </w:tc>
@@ -10822,7 +8450,7 @@
                 <w:color w:val="202124"/>
                 <w:sz w:val="16"/>
               </w:rPr>
-              <w:t>Konijnen</w:t>
+              <w:t>Voorzieningen</w:t>
             </w:r>
           </w:p>
         </w:tc>
@@ -10848,7 +8476,7 @@
                 <w:color w:val="202124"/>
                 <w:sz w:val="16"/>
               </w:rPr>
-              <w:t>Vaste transecten, relatieve aantallen, seizoen, inspanning, protocol en ziekte-informatie.</w:t>
+              <w:t>Type, ligging en geldigheidsperiode voor begrazingsrelevante voorzieningen.</w:t>
             </w:r>
           </w:p>
         </w:tc>
@@ -10874,7 +8502,7 @@
                 <w:color w:val="202124"/>
                 <w:sz w:val="16"/>
               </w:rPr>
-              <w:t>Minstens voorjaar en najaar</w:t>
+              <w:t>Bij plaatsing/wijziging</w:t>
             </w:r>
           </w:p>
         </w:tc>
@@ -10929,7 +8557,7 @@
                 <w:color w:val="202124"/>
                 <w:sz w:val="16"/>
               </w:rPr>
-              <w:t>Weer en droogte</w:t>
+              <w:t>Externe koppelsleutel</w:t>
             </w:r>
           </w:p>
         </w:tc>
@@ -10954,7 +8582,7 @@
                 <w:color w:val="202124"/>
                 <w:sz w:val="16"/>
               </w:rPr>
-              <w:t>Neerslag, temperatuur, neerslagtekort/droogte-index; koppeling aan bronstation of raster.</w:t>
+              <w:t>Bronsysteem, externe sleutel, gekoppelde kernentiteit en geldigheid.</w:t>
             </w:r>
           </w:p>
         </w:tc>
@@ -10979,221 +8607,7 @@
                 <w:color w:val="202124"/>
                 <w:sz w:val="16"/>
               </w:rPr>
-              <w:t>Dagelijks brondata; jaarlijks afleiden</w:t>
-            </w:r>
-          </w:p>
-        </w:tc>
-      </w:tr>
-      <w:tr>
-        <w:trPr>
-          <w:cantSplit w:val="true"/>
-        </w:trPr>
-        <w:tc>
-          <w:tcPr>
-            <w:tcW w:type="dxa" w:w="1400"/>
-            <w:shd w:fill="F8FAFB"/>
-            <w:tcMar>
-              <w:top w:w="90" w:type="dxa"/>
-              <w:start w:w="120" w:type="dxa"/>
-              <w:bottom w:w="90" w:type="dxa"/>
-              <w:end w:w="120" w:type="dxa"/>
-            </w:tcMar>
-            <w:vAlign w:val="center"/>
-          </w:tcPr>
-          <w:p>
-            <w:pPr>
-              <w:spacing w:after="0" w:line="240" w:lineRule="auto"/>
-            </w:pPr>
-            <w:r>
-              <w:rPr>
-                <w:rFonts w:ascii="Arial" w:hAnsi="Arial"/>
-                <w:color w:val="202124"/>
-                <w:sz w:val="16"/>
-              </w:rPr>
-              <w:t>2. Sterk aanbevolen</w:t>
-            </w:r>
-          </w:p>
-        </w:tc>
-        <w:tc>
-          <w:tcPr>
-            <w:tcW w:type="dxa" w:w="1700"/>
-            <w:shd w:fill="F8FAFB"/>
-            <w:tcMar>
-              <w:top w:w="90" w:type="dxa"/>
-              <w:start w:w="120" w:type="dxa"/>
-              <w:bottom w:w="90" w:type="dxa"/>
-              <w:end w:w="120" w:type="dxa"/>
-            </w:tcMar>
-            <w:vAlign w:val="center"/>
-          </w:tcPr>
-          <w:p>
-            <w:pPr>
-              <w:spacing w:after="0" w:line="240" w:lineRule="auto"/>
-            </w:pPr>
-            <w:r>
-              <w:rPr>
-                <w:rFonts w:ascii="Arial" w:hAnsi="Arial"/>
-                <w:color w:val="202124"/>
-                <w:sz w:val="16"/>
-              </w:rPr>
-              <w:t>Standplaats</w:t>
-            </w:r>
-          </w:p>
-        </w:tc>
-        <w:tc>
-          <w:tcPr>
-            <w:tcW w:type="dxa" w:w="4560"/>
-            <w:shd w:fill="F8FAFB"/>
-            <w:tcMar>
-              <w:top w:w="90" w:type="dxa"/>
-              <w:start w:w="120" w:type="dxa"/>
-              <w:bottom w:w="90" w:type="dxa"/>
-              <w:end w:w="120" w:type="dxa"/>
-            </w:tcMar>
-            <w:vAlign w:val="center"/>
-          </w:tcPr>
-          <w:p>
-            <w:pPr>
-              <w:spacing w:after="0" w:line="240" w:lineRule="auto"/>
-            </w:pPr>
-            <w:r>
-              <w:rPr>
-                <w:rFonts w:ascii="Arial" w:hAnsi="Arial"/>
-                <w:color w:val="202124"/>
-                <w:sz w:val="16"/>
-              </w:rPr>
-              <w:t>Habitat, kalk/pH, vocht, reliëf/expositie, bodemkenmerken en relevante wijzigingen.</w:t>
-            </w:r>
-          </w:p>
-        </w:tc>
-        <w:tc>
-          <w:tcPr>
-            <w:tcW w:type="dxa" w:w="1700"/>
-            <w:shd w:fill="F8FAFB"/>
-            <w:tcMar>
-              <w:top w:w="90" w:type="dxa"/>
-              <w:start w:w="120" w:type="dxa"/>
-              <w:bottom w:w="90" w:type="dxa"/>
-              <w:end w:w="120" w:type="dxa"/>
-            </w:tcMar>
-            <w:vAlign w:val="center"/>
-          </w:tcPr>
-          <w:p>
-            <w:pPr>
-              <w:spacing w:after="0" w:line="240" w:lineRule="auto"/>
-            </w:pPr>
-            <w:r>
-              <w:rPr>
-                <w:rFonts w:ascii="Arial" w:hAnsi="Arial"/>
-                <w:color w:val="202124"/>
-                <w:sz w:val="16"/>
-              </w:rPr>
-              <w:t>Nulmeting en volgens protocol</w:t>
-            </w:r>
-          </w:p>
-        </w:tc>
-      </w:tr>
-      <w:tr>
-        <w:trPr>
-          <w:cantSplit w:val="true"/>
-        </w:trPr>
-        <w:tc>
-          <w:tcPr>
-            <w:tcW w:type="dxa" w:w="1400"/>
-            <w:tcMar>
-              <w:top w:w="90" w:type="dxa"/>
-              <w:start w:w="120" w:type="dxa"/>
-              <w:bottom w:w="90" w:type="dxa"/>
-              <w:end w:w="120" w:type="dxa"/>
-            </w:tcMar>
-            <w:vAlign w:val="center"/>
-          </w:tcPr>
-          <w:p>
-            <w:pPr>
-              <w:spacing w:after="0" w:line="240" w:lineRule="auto"/>
-            </w:pPr>
-            <w:r>
-              <w:rPr>
-                <w:rFonts w:ascii="Arial" w:hAnsi="Arial"/>
-                <w:color w:val="202124"/>
-                <w:sz w:val="16"/>
-              </w:rPr>
-              <w:t>2. Sterk aanbevolen</w:t>
-            </w:r>
-          </w:p>
-        </w:tc>
-        <w:tc>
-          <w:tcPr>
-            <w:tcW w:type="dxa" w:w="1700"/>
-            <w:tcMar>
-              <w:top w:w="90" w:type="dxa"/>
-              <w:start w:w="120" w:type="dxa"/>
-              <w:bottom w:w="90" w:type="dxa"/>
-              <w:end w:w="120" w:type="dxa"/>
-            </w:tcMar>
-            <w:vAlign w:val="center"/>
-          </w:tcPr>
-          <w:p>
-            <w:pPr>
-              <w:spacing w:after="0" w:line="240" w:lineRule="auto"/>
-            </w:pPr>
-            <w:r>
-              <w:rPr>
-                <w:rFonts w:ascii="Arial" w:hAnsi="Arial"/>
-                <w:color w:val="202124"/>
-                <w:sz w:val="16"/>
-              </w:rPr>
-              <w:t>N-depositie en grondwater</w:t>
-            </w:r>
-          </w:p>
-        </w:tc>
-        <w:tc>
-          <w:tcPr>
-            <w:tcW w:type="dxa" w:w="4560"/>
-            <w:tcMar>
-              <w:top w:w="90" w:type="dxa"/>
-              <w:start w:w="120" w:type="dxa"/>
-              <w:bottom w:w="90" w:type="dxa"/>
-              <w:end w:w="120" w:type="dxa"/>
-            </w:tcMar>
-            <w:vAlign w:val="center"/>
-          </w:tcPr>
-          <w:p>
-            <w:pPr>
-              <w:spacing w:after="0" w:line="240" w:lineRule="auto"/>
-            </w:pPr>
-            <w:r>
-              <w:rPr>
-                <w:rFonts w:ascii="Arial" w:hAnsi="Arial"/>
-                <w:color w:val="202124"/>
-                <w:sz w:val="16"/>
-              </w:rPr>
-              <w:t>Bron, periode, resolutie, waarde en eenheid.</w:t>
-            </w:r>
-          </w:p>
-        </w:tc>
-        <w:tc>
-          <w:tcPr>
-            <w:tcW w:type="dxa" w:w="1700"/>
-            <w:tcMar>
-              <w:top w:w="90" w:type="dxa"/>
-              <w:start w:w="120" w:type="dxa"/>
-              <w:bottom w:w="90" w:type="dxa"/>
-              <w:end w:w="120" w:type="dxa"/>
-            </w:tcMar>
-            <w:vAlign w:val="center"/>
-          </w:tcPr>
-          <w:p>
-            <w:pPr>
-              <w:spacing w:after="0" w:line="240" w:lineRule="auto"/>
-            </w:pPr>
-            <w:r>
-              <w:rPr>
-                <w:rFonts w:ascii="Arial" w:hAnsi="Arial"/>
-                <w:color w:val="202124"/>
-                <w:sz w:val="16"/>
-              </w:rPr>
-              <w:t>Jaarlijks/meetfrequentie bron</w:t>
+              <w:t>Zodra aansluiting bekend is</w:t>
             </w:r>
           </w:p>
         </w:tc>
@@ -11250,7 +8664,7 @@
                 <w:color w:val="202124"/>
                 <w:sz w:val="16"/>
               </w:rPr>
-              <w:t>GPS en voorzieningen</w:t>
+              <w:t>GPS-terreingebruik</w:t>
             </w:r>
           </w:p>
         </w:tc>
@@ -11276,7 +8690,7 @@
                 <w:color w:val="202124"/>
                 <w:sz w:val="16"/>
               </w:rPr>
-              <w:t>Dier/apparaat, tijd, positie, nauwkeurigheid; waterpunten, poorten, voer- en vangplaatsen.</w:t>
+              <w:t>Dier/apparaat, meettijd, positie, nauwkeurigheid, methode en kwaliteitsstatus.</w:t>
             </w:r>
           </w:p>
         </w:tc>
@@ -11303,111 +8717,6 @@
                 <w:sz w:val="16"/>
               </w:rPr>
               <w:t>Continu of steekproef</w:t>
-            </w:r>
-          </w:p>
-        </w:tc>
-      </w:tr>
-      <w:tr>
-        <w:trPr>
-          <w:cantSplit w:val="true"/>
-        </w:trPr>
-        <w:tc>
-          <w:tcPr>
-            <w:tcW w:type="dxa" w:w="1400"/>
-            <w:tcMar>
-              <w:top w:w="90" w:type="dxa"/>
-              <w:start w:w="120" w:type="dxa"/>
-              <w:bottom w:w="90" w:type="dxa"/>
-              <w:end w:w="120" w:type="dxa"/>
-            </w:tcMar>
-            <w:vAlign w:val="center"/>
-          </w:tcPr>
-          <w:p>
-            <w:pPr>
-              <w:spacing w:after="0" w:line="240" w:lineRule="auto"/>
-            </w:pPr>
-            <w:r>
-              <w:rPr>
-                <w:rFonts w:ascii="Arial" w:hAnsi="Arial"/>
-                <w:color w:val="202124"/>
-                <w:sz w:val="16"/>
-              </w:rPr>
-              <w:t>3. Optioneel</w:t>
-            </w:r>
-          </w:p>
-        </w:tc>
-        <w:tc>
-          <w:tcPr>
-            <w:tcW w:type="dxa" w:w="1700"/>
-            <w:tcMar>
-              <w:top w:w="90" w:type="dxa"/>
-              <w:start w:w="120" w:type="dxa"/>
-              <w:bottom w:w="90" w:type="dxa"/>
-              <w:end w:w="120" w:type="dxa"/>
-            </w:tcMar>
-            <w:vAlign w:val="center"/>
-          </w:tcPr>
-          <w:p>
-            <w:pPr>
-              <w:spacing w:after="0" w:line="240" w:lineRule="auto"/>
-            </w:pPr>
-            <w:r>
-              <w:rPr>
-                <w:rFonts w:ascii="Arial" w:hAnsi="Arial"/>
-                <w:color w:val="202124"/>
-                <w:sz w:val="16"/>
-              </w:rPr>
-              <w:t>Luchtfoto/remote sensing</w:t>
-            </w:r>
-          </w:p>
-        </w:tc>
-        <w:tc>
-          <w:tcPr>
-            <w:tcW w:type="dxa" w:w="4560"/>
-            <w:tcMar>
-              <w:top w:w="90" w:type="dxa"/>
-              <w:start w:w="120" w:type="dxa"/>
-              <w:bottom w:w="90" w:type="dxa"/>
-              <w:end w:w="120" w:type="dxa"/>
-            </w:tcMar>
-            <w:vAlign w:val="center"/>
-          </w:tcPr>
-          <w:p>
-            <w:pPr>
-              <w:spacing w:after="0" w:line="240" w:lineRule="auto"/>
-            </w:pPr>
-            <w:r>
-              <w:rPr>
-                <w:rFonts w:ascii="Arial" w:hAnsi="Arial"/>
-                <w:color w:val="202124"/>
-                <w:sz w:val="16"/>
-              </w:rPr>
-              <w:t>Opnamedatum, sensor, resolutie, classificatiemethode en kwaliteitsmaat.</w:t>
-            </w:r>
-          </w:p>
-        </w:tc>
-        <w:tc>
-          <w:tcPr>
-            <w:tcW w:type="dxa" w:w="1700"/>
-            <w:tcMar>
-              <w:top w:w="90" w:type="dxa"/>
-              <w:start w:w="120" w:type="dxa"/>
-              <w:bottom w:w="90" w:type="dxa"/>
-              <w:end w:w="120" w:type="dxa"/>
-            </w:tcMar>
-            <w:vAlign w:val="center"/>
-          </w:tcPr>
-          <w:p>
-            <w:pPr>
-              <w:spacing w:after="0" w:line="240" w:lineRule="auto"/>
-            </w:pPr>
-            <w:r>
-              <w:rPr>
-                <w:rFonts w:ascii="Arial" w:hAnsi="Arial"/>
-                <w:color w:val="202124"/>
-                <w:sz w:val="16"/>
-              </w:rPr>
-              <w:t>Vaste meerjarige cyclus</w:t>
             </w:r>
           </w:p>
         </w:tc>
@@ -11453,7 +8762,7 @@
                 <w:color w:val="183847"/>
                 <w:sz w:val="21"/>
               </w:rPr>
-              <w:t xml:space="preserve">Nulsituatie: </w:t>
+              <w:t xml:space="preserve">Startpositie 2026: </w:t>
             </w:r>
             <w:r>
               <w:rPr>
@@ -11461,7 +8770,7 @@
                 <w:color w:val="202124"/>
                 <w:sz w:val="21"/>
               </w:rPr>
-              <w:t>Als begrazing al vóór 2026 aanwezig was, noem een meting in 2026 niet automatisch nulmeting. Registreer haar als eerste beschikbare referentiemeting en leg vast hoeveel beheerhistorie bekend of onbekend is.</w:t>
+              <w:t>Als begrazing al vóór 2026 aanwezig was, leg dan vast vanaf welke datum de beheerhistorie betrouwbaar is en welke oudere gegevens volledig, gedeeltelijk of onbekend zijn. Vul onbekende historie niet stilzwijgend als nul in.</w:t>
             </w:r>
           </w:p>
         </w:tc>
@@ -11478,7 +8787,7 @@
         <w:keepNext/>
       </w:pPr>
       <w:r>
-        <w:t>10. Minimale monitoringopzet voor verantwoorde evaluatie</w:t>
+        <w:t>10. Minimale registratieprocedure vanaf 2026</w:t>
       </w:r>
     </w:p>
     <w:p>
@@ -11492,7 +8801,7 @@
           <w:color w:val="202124"/>
           <w:sz w:val="21"/>
         </w:rPr>
-        <w:t>Selecteer enkele gebieden waar beheer vanaf 2026 aantoonbaar verandert en enkele zo vergelijkbaar mogelijke gebieden waar dat niet gebeurt.</w:t>
+        <w:t>Ken ieder beheergebied één stabiele code toe en maak bij een grenswijziging een nieuwe gebiedsversie; overschrijf de oude geometrie niet.</w:t>
       </w:r>
     </w:p>
     <w:p>
@@ -11506,7 +8815,7 @@
           <w:color w:val="202124"/>
           <w:sz w:val="21"/>
         </w:rPr>
-        <w:t>Meet behandeld en vergelijkingsgebied vóór de wijziging volgens hetzelfde protocol. Eén voor-meting is kwetsbaar; herhaalde voor-metingen zijn sterker waar praktisch haalbaar.</w:t>
+        <w:t>Maak vóór de start een geplande begrazingsperiode met regime, doel, verwacht tijdvak, begrazingsgebied en verwachte kudde.</w:t>
       </w:r>
     </w:p>
     <w:p>
@@ -11520,7 +8829,7 @@
           <w:color w:val="202124"/>
           <w:sz w:val="21"/>
         </w:rPr>
-        <w:t>Leg vooraf vast welke meetlocaties permanent blijven en welke omstandigheden een verplaatsing rechtvaardigen. Maak bij verplaatsing een nieuwe locatieversie.</w:t>
+        <w:t>Bevestig bij inscharen de werkelijke start, het werkelijk toegankelijke vlak en de feitelijke kuddesamenstelling.</w:t>
       </w:r>
     </w:p>
     <w:p>
@@ -11534,7 +8843,7 @@
           <w:color w:val="202124"/>
           <w:sz w:val="21"/>
         </w:rPr>
-        <w:t>Meet vegetatiestructuur en bloemaanbod op vaste momenten. Behoud daarnaast bestaande vogel-, konijnen-, vlinder- en permanente-kwadratreeksen met hun eigen protocollen.</w:t>
+        <w:t>Begin een nieuwe fase zodra aantal of categorie grazers, toegankelijk vlak, regime of onderbrekingsstatus verandert.</w:t>
       </w:r>
     </w:p>
     <w:p>
@@ -11548,7 +8857,7 @@
           <w:color w:val="202124"/>
           <w:sz w:val="21"/>
         </w:rPr>
-        <w:t>Registreer mislukt of afwijkend beheer expliciet. Analyseer het feitelijk uitgevoerde beheer; rapporteer daarnaast de oorspronkelijke bedoeling.</w:t>
+        <w:t>Registreer tijdelijke uitsluiting als fase of als wijziging van het toegankelijk vlak, inclusief begin, einde en reden.</w:t>
       </w:r>
     </w:p>
     <w:p>
@@ -11562,7 +8871,7 @@
           <w:color w:val="202124"/>
           <w:sz w:val="21"/>
         </w:rPr>
-        <w:t>Leg weers- en droogtegegevens vast of koppel ze reproduceerbaar, omdat extreme jaren een begrazingseffect kunnen overheersen.</w:t>
+        <w:t>Leg iedere afwijking van plan en administratie afzonderlijk vast met bron en zekerheidsstatus.</w:t>
       </w:r>
     </w:p>
     <w:p>
@@ -11576,7 +8885,21 @@
           <w:color w:val="202124"/>
           <w:sz w:val="21"/>
         </w:rPr>
-        <w:t>Bewaar ook uitkomsten die niet bij het beheerdoel passen. Verschillende diergroepen kunnen tegengesteld reageren.</w:t>
+        <w:t>Sluit de periode af met werkelijke einddatum, laatste dierenaantallen, controle van GVE-berekening en verantwoordelijke.</w:t>
+      </w:r>
+    </w:p>
+    <w:p>
+      <w:pPr>
+        <w:pStyle w:val="ListNumber"/>
+        <w:spacing w:after="100" w:line="264" w:lineRule="auto"/>
+      </w:pPr>
+      <w:r>
+        <w:rPr>
+          <w:rFonts w:ascii="Arial" w:hAnsi="Arial"/>
+          <w:color w:val="202124"/>
+          <w:sz w:val="21"/>
+        </w:rPr>
+        <w:t>Bewaar externe sleutels zodra die bekend zijn, maar kopieer inhoud uit andere systemen niet naar dit begrazingsmodel.</w:t>
       </w:r>
     </w:p>
     <w:p>
@@ -11599,7 +8922,7 @@
           <w:color w:val="202124"/>
           <w:sz w:val="21"/>
         </w:rPr>
-        <w:t>Geldigheidsperioden van gebiedsversies, meetlocatieversies en GVE-normen binnen dezelfde ouderrecord mogen niet overlappen.</w:t>
+        <w:t>Geldigheidsperioden van gebiedsversies en GVE-normen binnen dezelfde ouderrecord mogen niet overlappen.</w:t>
       </w:r>
     </w:p>
     <w:p>
@@ -11683,7 +9006,7 @@
           <w:color w:val="202124"/>
           <w:sz w:val="21"/>
         </w:rPr>
-        <w:t>Een meetbezoek moet verwijzen naar de locatieversie die op de bezoekdatum geldig was.</w:t>
+        <w:t>Een begrazingsgebied moet verwijzen naar de gebiedsversie die tijdens de begrazingsperiode geldig was.</w:t>
       </w:r>
     </w:p>
     <w:p>
@@ -11697,7 +9020,7 @@
           <w:color w:val="202124"/>
           <w:sz w:val="21"/>
         </w:rPr>
-        <w:t>Waarde, eenheid, methode en kwaliteitsstatus zijn samen verplicht voor standplaats-, wildgrazer- en omgevingsmetingen.</w:t>
+        <w:t>Een onbekend aantal dieren is niet nul. Gebruik afzonderlijke statuscodes voor geteld, administratief bevestigd, geschat en onbekend.</w:t>
       </w:r>
     </w:p>
     <w:p>
@@ -11711,7 +9034,7 @@
           <w:color w:val="202124"/>
           <w:sz w:val="21"/>
         </w:rPr>
-        <w:t>Een ontbrekende waarneming is niet automatisch nul. Gebruik afzonderlijke statuscodes voor niet gemeten, niet aangetroffen en niet van toepassing.</w:t>
+        <w:t>Een externe koppelsleutel is uniek binnen het opgegeven bronsysteem en verwijst naar een bestaande kernentiteit.</w:t>
       </w:r>
     </w:p>
     <w:p>
@@ -11725,7 +9048,7 @@
           <w:color w:val="202124"/>
           <w:sz w:val="21"/>
         </w:rPr>
-        <w:t>Historische beheer- en meetrecords worden niet fysiek verwijderd; correcties krijgen auditinformatie en zo nodig een opvolgende versie.</w:t>
+        <w:t>Historische begrazingsrecords worden niet fysiek verwijderd; correcties krijgen auditinformatie en zo nodig een opvolgende versie.</w:t>
       </w:r>
     </w:p>
     <w:p>
@@ -11762,7 +9085,7 @@
           <w:color w:val="202124"/>
           <w:sz w:val="21"/>
         </w:rPr>
-        <w:t>Geen volledige opslagstructuur voor alle vogel-, vegetatie-, vlinder- of bodemfaunawaarnemingen; bestaande domeindatabases blijven leidend.</w:t>
+        <w:t>Geen inhoudelijke opslagstructuur voor ecologische of andere externe meetreeksen.</w:t>
       </w:r>
     </w:p>
     <w:p>
@@ -11776,7 +9099,7 @@
           <w:color w:val="202124"/>
           <w:sz w:val="21"/>
         </w:rPr>
-        <w:t>Geen vaste universele succesindicator voor begrazing.</w:t>
+        <w:t>Geen inhoudelijke uitwerking van andere typen beheergebeurtenissen; alleen het neutrale uitbreidingspunt wordt gereserveerd.</w:t>
       </w:r>
     </w:p>
     <w:p>
@@ -11790,7 +9113,7 @@
           <w:color w:val="202124"/>
           <w:sz w:val="21"/>
         </w:rPr>
-        <w:t>Geen automatische causale conclusie uit een ruimtelijke en temporele samenhang.</w:t>
+        <w:t>Geen evaluatie-, onderzoeks- of succesindicatoren; dit concept registreert uitsluitend de begrazingsblootstelling.</w:t>
       </w:r>
     </w:p>
     <w:p>
@@ -11827,7 +9150,7 @@
           <w:color w:val="202124"/>
           <w:sz w:val="21"/>
         </w:rPr>
-        <w:t>Laat een database-technicus dit concept samen met beheerder en gegevenshouders vertalen naar een logisch datamodel. Begin daarvoor met drie concrete reconstructies uit 2026: een ongewijzigde jaarrondbegrazing, een seizoen met tussentijdse kuddewijziging en een tijdelijke uitsluiting met afwijking. Als het model voor iedere locatie en datum de werkelijke blootstelling kan teruggeven en aan een bestaand meetbezoek kan koppelen, is de kern geslaagd.</w:t>
+        <w:t>Laat een database-technicus dit concept samen met de beheerder vertalen naar een logisch datamodel. Test dat ontwerp met drie reconstructies uit 2026: een ongewijzigde jaarrondbegrazing, een seizoen met tussentijdse kuddewijziging en een tijdelijke uitsluiting met afwijking. De technische uitwerking moet historie bewaren en iedere afgeleide veebezetting reproduceerbaar maken.</w:t>
       </w:r>
     </w:p>
     <w:tbl>
@@ -11873,7 +9196,7 @@
                 <w:color w:val="202124"/>
                 <w:sz w:val="21"/>
               </w:rPr>
-              <w:t>Gegeven een meetlocatie en datum moet één query kunnen tonen: geldige gebiedsgeometrie, toegankelijkheid, aanwezige grazers, GVE-norm, veebezetting, bekende afwijkingen, andere maatregelen, vergelijkingsrol en beschikbare ecologische/contextmetingen.</w:t>
+              <w:t>Gegeven een locatie en datum moet één query kunnen tonen: geldige gebiedsversie, werkelijk toegankelijk vlak, actieve begrazingsfase, aanwezige grazercategorieën en aantallen, gebruikte GVE-norm, veebezetting, bekende afwijkingen, bron/zekerheid en beschikbare externe sleutels.</w:t>
             </w:r>
           </w:p>
         </w:tc>

</xml_diff>